<commit_message>
docs: update requirements docx to reflect as-built LAN topology
Remove all DDNS/DuckDNS/port-forwarding references. VPS and IPX800
are on the same LAN -- IPX800 reached directly by local IP:80.

Changes applied:
- Status: Draft -> Updated As-Built
- Abstract: add as-built note
- Network topology table: remove DuckDNS row, update VPS/Router/IPX800
- Data flow: replace DDNS resolution step with direct LAN call
- Tech stack: remove DDNS and Port Forwarding rows, update httpx entry
- FastAPI component table: update host/port references
- Prerequisites: remove CG-NAT/DDNS/port-forwarding rows, renumber
- Risk register: remove CG-NAT, DDNS lag, ISP port-blocking risks
- Phase 1 steps: replace DDNS setup with LAN verification steps
- Env config: IPX800_HOST=<IPX800-LAN-IP>, IPX800_PORT=80, no DuckDNS

Co-Authored-By: Claude Sonnet 4.6 <noreply@anthropic.com>
</commit_message>
<xml_diff>
--- a/docs/whatsapp_iot_requirements_v2_en_1.docx
+++ b/docs/whatsapp_iot_requirements_v2_en_1.docx
@@ -291,12 +291,7 @@
           </w:tcPr>
           <w:p>
             <w:r>
-              <w:rPr>
-                <w:rFonts w:ascii="Arial" w:cs="Arial" w:eastAsia="Arial" w:hAnsi="Arial"/>
-                <w:sz w:val="22"/>
-                <w:szCs w:val="22"/>
-              </w:rPr>
-              <w:t xml:space="preserve">Draft — Pre-Development</w:t>
+              <w:t>Updated — As-Built (reflects deployed implementation)</w:t>
             </w:r>
           </w:p>
         </w:tc>
@@ -492,24 +487,7 @@
         <w:spacing w:after="80" w:before="80"/>
       </w:pPr>
       <w:r>
-        <w:rPr>
-          <w:rFonts w:ascii="Arial" w:cs="Arial" w:eastAsia="Arial" w:hAnsi="Arial"/>
-          <w:b/>
-          <w:bCs/>
-          <w:color w:val="1F4E79"/>
-          <w:sz w:val="22"/>
-          <w:szCs w:val="22"/>
-        </w:rPr>
-        <w:t xml:space="preserve">Abstract: </w:t>
-      </w:r>
-      <w:r>
-        <w:rPr>
-          <w:rFonts w:ascii="Arial" w:cs="Arial" w:eastAsia="Arial" w:hAnsi="Arial"/>
-          <w:color w:val="222222"/>
-          <w:sz w:val="22"/>
-          <w:szCs w:val="22"/>
-        </w:rPr>
-        <w:t xml:space="preserve">This document consolidates all requirements gathered across the full design conversation, combined with analysis of the IPX800 V4 hardware manual. It defines what the system must do, how it should be built, the complete technology stack, prerequisites, and a phased implementation plan.</w:t>
+        <w:t>Abstract: This document consolidates all requirements gathered across the full design conversation, combined with analysis of the IPX800 V4 hardware manual. UPDATED: This version reflects the as-built implementation. Key divergence from the original design: the VPS and IPX800 are on the same LAN -- no DDNS, no Cloudflare Tunnel, and no router port forwarding are used. The authoritative as-built reference is docs/documentation.md.</w:t>
       </w:r>
     </w:p>
     <w:p>
@@ -8154,13 +8132,7 @@
         <w:spacing w:after="80" w:before="80"/>
       </w:pPr>
       <w:r>
-        <w:rPr>
-          <w:rFonts w:ascii="Arial" w:cs="Arial" w:eastAsia="Arial" w:hAnsi="Arial"/>
-          <w:color w:val="222222"/>
-          <w:sz w:val="22"/>
-          <w:szCs w:val="22"/>
-        </w:rPr>
-        <w:t xml:space="preserve">The following topology reflects the confirmed setup: VPS on cloud, IPX800 on a separate home LAN with a dynamic public IP, connected via DDNS + port forwarding.</w:t>
+        <w:t>The following topology reflects the as-built deployment: VPS and IPX800 are on the same LAN. The FastAPI service reaches the IPX800 directly by its local IP address -- no DDNS, no port forwarding, no router traversal is required.</w:t>
       </w:r>
     </w:p>
     <w:p>
@@ -8389,15 +8361,7 @@
               <w:jc w:val="left"/>
             </w:pPr>
             <w:r>
-              <w:rPr>
-                <w:rFonts w:ascii="Arial" w:cs="Arial" w:eastAsia="Arial" w:hAnsi="Arial"/>
-                <w:b w:val="false"/>
-                <w:bCs w:val="false"/>
-                <w:color w:val="000000"/>
-                <w:sz w:val="20"/>
-                <w:szCs w:val="20"/>
-              </w:rPr>
-              <w:t xml:space="preserve">Public IP + domain name. Hosts the entire backend. Reaches IPX800 via DDNS hostname.</w:t>
+              <w:t>Public IP + domain name. Hosts both backend services (Node.js + Python FastAPI). Reaches IPX800 directly via shared LAN -- no DDNS resolution needed.</w:t>
             </w:r>
           </w:p>
         </w:tc>
@@ -8412,29 +8376,21 @@
               <w:bottom w:val="single" w:color="CCCCCC" w:sz="1"/>
               <w:right w:val="single" w:color="CCCCCC" w:sz="1"/>
             </w:tcBorders>
-            <w:shd w:fill="FFFFFF" w:val="clear"/>
-            <w:tcMar>
-              <w:top w:type="dxa" w:w="80"/>
-              <w:left w:type="dxa" w:w="150"/>
-              <w:bottom w:type="dxa" w:w="80"/>
-              <w:right w:type="dxa" w:w="150"/>
-            </w:tcMar>
-            <w:vAlign w:val="center"/>
-          </w:tcPr>
-          <w:p>
-            <w:pPr>
-              <w:jc w:val="left"/>
-            </w:pPr>
-            <w:r>
-              <w:rPr>
-                <w:rFonts w:ascii="Arial" w:cs="Arial" w:eastAsia="Arial" w:hAnsi="Arial"/>
-                <w:b w:val="false"/>
-                <w:bCs w:val="false"/>
-                <w:color w:val="000000"/>
-                <w:sz w:val="20"/>
-                <w:szCs w:val="20"/>
-              </w:rPr>
-              <w:t xml:space="preserve">DuckDNS</w:t>
+            <w:shd w:fill="F5F9FF" w:val="clear"/>
+            <w:tcMar>
+              <w:top w:type="dxa" w:w="80"/>
+              <w:left w:type="dxa" w:w="150"/>
+              <w:bottom w:type="dxa" w:w="80"/>
+              <w:right w:type="dxa" w:w="150"/>
+            </w:tcMar>
+            <w:vAlign w:val="center"/>
+          </w:tcPr>
+          <w:p>
+            <w:pPr>
+              <w:jc w:val="left"/>
+            </w:pPr>
+            <w:r>
+              <w:t>Home Router</w:t>
             </w:r>
           </w:p>
         </w:tc>
@@ -8447,29 +8403,21 @@
               <w:bottom w:val="single" w:color="CCCCCC" w:sz="1"/>
               <w:right w:val="single" w:color="CCCCCC" w:sz="1"/>
             </w:tcBorders>
-            <w:shd w:fill="FFFFFF" w:val="clear"/>
-            <w:tcMar>
-              <w:top w:type="dxa" w:w="80"/>
-              <w:left w:type="dxa" w:w="150"/>
-              <w:bottom w:type="dxa" w:w="80"/>
-              <w:right w:type="dxa" w:w="150"/>
-            </w:tcMar>
-            <w:vAlign w:val="center"/>
-          </w:tcPr>
-          <w:p>
-            <w:pPr>
-              <w:jc w:val="left"/>
-            </w:pPr>
-            <w:r>
-              <w:rPr>
-                <w:rFonts w:ascii="Arial" w:cs="Arial" w:eastAsia="Arial" w:hAnsi="Arial"/>
-                <w:b w:val="false"/>
-                <w:bCs w:val="false"/>
-                <w:color w:val="000000"/>
-                <w:sz w:val="20"/>
-                <w:szCs w:val="20"/>
-              </w:rPr>
-              <w:t xml:space="preserve">DuckDNS CDN (free)</w:t>
+            <w:shd w:fill="F5F9FF" w:val="clear"/>
+            <w:tcMar>
+              <w:top w:type="dxa" w:w="80"/>
+              <w:left w:type="dxa" w:w="150"/>
+              <w:bottom w:type="dxa" w:w="80"/>
+              <w:right w:type="dxa" w:w="150"/>
+            </w:tcMar>
+            <w:vAlign w:val="center"/>
+          </w:tcPr>
+          <w:p>
+            <w:pPr>
+              <w:jc w:val="left"/>
+            </w:pPr>
+            <w:r>
+              <w:t>Home LAN gateway</w:t>
             </w:r>
           </w:p>
         </w:tc>
@@ -8482,29 +8430,21 @@
               <w:bottom w:val="single" w:color="CCCCCC" w:sz="1"/>
               <w:right w:val="single" w:color="CCCCCC" w:sz="1"/>
             </w:tcBorders>
-            <w:shd w:fill="FFFFFF" w:val="clear"/>
-            <w:tcMar>
-              <w:top w:type="dxa" w:w="80"/>
-              <w:left w:type="dxa" w:w="150"/>
-              <w:bottom w:type="dxa" w:w="80"/>
-              <w:right w:type="dxa" w:w="150"/>
-            </w:tcMar>
-            <w:vAlign w:val="center"/>
-          </w:tcPr>
-          <w:p>
-            <w:pPr>
-              <w:jc w:val="left"/>
-            </w:pPr>
-            <w:r>
-              <w:rPr>
-                <w:rFonts w:ascii="Arial" w:cs="Arial" w:eastAsia="Arial" w:hAnsi="Arial"/>
-                <w:b w:val="false"/>
-                <w:bCs w:val="false"/>
-                <w:color w:val="000000"/>
-                <w:sz w:val="20"/>
-                <w:szCs w:val="20"/>
-              </w:rPr>
-              <w:t xml:space="preserve">Maps dynamic home public IP to a fixed hostname (xxx.duckdns.org). Updated every 5 minutes by router or cron.</w:t>
+            <w:shd w:fill="F5F9FF" w:val="clear"/>
+            <w:tcMar>
+              <w:top w:type="dxa" w:w="80"/>
+              <w:left w:type="dxa" w:w="150"/>
+              <w:bottom w:type="dxa" w:w="80"/>
+              <w:right w:type="dxa" w:w="150"/>
+            </w:tcMar>
+            <w:vAlign w:val="center"/>
+          </w:tcPr>
+          <w:p>
+            <w:pPr>
+              <w:jc w:val="left"/>
+            </w:pPr>
+            <w:r>
+              <w:t>VPS and IPX800 share the same LAN. No port forwarding configured. IPX800 assigned a static LAN IP in its Web UI.</w:t>
             </w:r>
           </w:p>
         </w:tc>
@@ -8519,29 +8459,29 @@
               <w:bottom w:val="single" w:color="CCCCCC" w:sz="1"/>
               <w:right w:val="single" w:color="CCCCCC" w:sz="1"/>
             </w:tcBorders>
-            <w:shd w:fill="F5F9FF" w:val="clear"/>
-            <w:tcMar>
-              <w:top w:type="dxa" w:w="80"/>
-              <w:left w:type="dxa" w:w="150"/>
-              <w:bottom w:type="dxa" w:w="80"/>
-              <w:right w:type="dxa" w:w="150"/>
-            </w:tcMar>
-            <w:vAlign w:val="center"/>
-          </w:tcPr>
-          <w:p>
-            <w:pPr>
-              <w:jc w:val="left"/>
-            </w:pPr>
-            <w:r>
-              <w:rPr>
-                <w:rFonts w:ascii="Arial" w:cs="Arial" w:eastAsia="Arial" w:hAnsi="Arial"/>
-                <w:b w:val="false"/>
-                <w:bCs w:val="false"/>
-                <w:color w:val="000000"/>
-                <w:sz w:val="20"/>
-                <w:szCs w:val="20"/>
-              </w:rPr>
-              <w:t xml:space="preserve">Home Router</w:t>
+            <w:shd w:fill="FFFFFF" w:val="clear"/>
+            <w:tcMar>
+              <w:top w:type="dxa" w:w="80"/>
+              <w:left w:type="dxa" w:w="150"/>
+              <w:bottom w:type="dxa" w:w="80"/>
+              <w:right w:type="dxa" w:w="150"/>
+            </w:tcMar>
+            <w:vAlign w:val="center"/>
+          </w:tcPr>
+          <w:p>
+            <w:pPr>
+              <w:jc w:val="left"/>
+            </w:pPr>
+            <w:r>
+              <w:rPr>
+                <w:rFonts w:ascii="Arial" w:cs="Arial" w:eastAsia="Arial" w:hAnsi="Arial"/>
+                <w:b w:val="false"/>
+                <w:bCs w:val="false"/>
+                <w:color w:val="000000"/>
+                <w:sz w:val="20"/>
+                <w:szCs w:val="20"/>
+              </w:rPr>
+              <w:t xml:space="preserve">IPX800 V4</w:t>
             </w:r>
           </w:p>
         </w:tc>
@@ -8554,29 +8494,29 @@
               <w:bottom w:val="single" w:color="CCCCCC" w:sz="1"/>
               <w:right w:val="single" w:color="CCCCCC" w:sz="1"/>
             </w:tcBorders>
-            <w:shd w:fill="F5F9FF" w:val="clear"/>
-            <w:tcMar>
-              <w:top w:type="dxa" w:w="80"/>
-              <w:left w:type="dxa" w:w="150"/>
-              <w:bottom w:type="dxa" w:w="80"/>
-              <w:right w:type="dxa" w:w="150"/>
-            </w:tcMar>
-            <w:vAlign w:val="center"/>
-          </w:tcPr>
-          <w:p>
-            <w:pPr>
-              <w:jc w:val="left"/>
-            </w:pPr>
-            <w:r>
-              <w:rPr>
-                <w:rFonts w:ascii="Arial" w:cs="Arial" w:eastAsia="Arial" w:hAnsi="Arial"/>
-                <w:b w:val="false"/>
-                <w:bCs w:val="false"/>
-                <w:color w:val="000000"/>
-                <w:sz w:val="20"/>
-                <w:szCs w:val="20"/>
-              </w:rPr>
-              <w:t xml:space="preserve">Home LAN gateway</w:t>
+            <w:shd w:fill="FFFFFF" w:val="clear"/>
+            <w:tcMar>
+              <w:top w:type="dxa" w:w="80"/>
+              <w:left w:type="dxa" w:w="150"/>
+              <w:bottom w:type="dxa" w:w="80"/>
+              <w:right w:type="dxa" w:w="150"/>
+            </w:tcMar>
+            <w:vAlign w:val="center"/>
+          </w:tcPr>
+          <w:p>
+            <w:pPr>
+              <w:jc w:val="left"/>
+            </w:pPr>
+            <w:r>
+              <w:rPr>
+                <w:rFonts w:ascii="Arial" w:cs="Arial" w:eastAsia="Arial" w:hAnsi="Arial"/>
+                <w:b w:val="false"/>
+                <w:bCs w:val="false"/>
+                <w:color w:val="000000"/>
+                <w:sz w:val="20"/>
+                <w:szCs w:val="20"/>
+              </w:rPr>
+              <w:t xml:space="preserve">Home LAN</w:t>
             </w:r>
           </w:p>
         </w:tc>
@@ -8589,43 +8529,6 @@
               <w:bottom w:val="single" w:color="CCCCCC" w:sz="1"/>
               <w:right w:val="single" w:color="CCCCCC" w:sz="1"/>
             </w:tcBorders>
-            <w:shd w:fill="F5F9FF" w:val="clear"/>
-            <w:tcMar>
-              <w:top w:type="dxa" w:w="80"/>
-              <w:left w:type="dxa" w:w="150"/>
-              <w:bottom w:type="dxa" w:w="80"/>
-              <w:right w:type="dxa" w:w="150"/>
-            </w:tcMar>
-            <w:vAlign w:val="center"/>
-          </w:tcPr>
-          <w:p>
-            <w:pPr>
-              <w:jc w:val="left"/>
-            </w:pPr>
-            <w:r>
-              <w:rPr>
-                <w:rFonts w:ascii="Arial" w:cs="Arial" w:eastAsia="Arial" w:hAnsi="Arial"/>
-                <w:b w:val="false"/>
-                <w:bCs w:val="false"/>
-                <w:color w:val="000000"/>
-                <w:sz w:val="20"/>
-                <w:szCs w:val="20"/>
-              </w:rPr>
-              <w:t xml:space="preserve">Receives inbound traffic on public port 8080. Port-forwards to IPX800 LAN IP:80. ACL restricts access to VPS IP only.</w:t>
-            </w:r>
-          </w:p>
-        </w:tc>
-      </w:tr>
-      <w:tr>
-        <w:tc>
-          <w:tcPr>
-            <w:tcW w:type="dxa" w:w="2200"/>
-            <w:tcBorders>
-              <w:top w:val="single" w:color="CCCCCC" w:sz="1"/>
-              <w:left w:val="single" w:color="CCCCCC" w:sz="1"/>
-              <w:bottom w:val="single" w:color="CCCCCC" w:sz="1"/>
-              <w:right w:val="single" w:color="CCCCCC" w:sz="1"/>
-            </w:tcBorders>
             <w:shd w:fill="FFFFFF" w:val="clear"/>
             <w:tcMar>
               <w:top w:type="dxa" w:w="80"/>
@@ -8640,85 +8543,7 @@
               <w:jc w:val="left"/>
             </w:pPr>
             <w:r>
-              <w:rPr>
-                <w:rFonts w:ascii="Arial" w:cs="Arial" w:eastAsia="Arial" w:hAnsi="Arial"/>
-                <w:b w:val="false"/>
-                <w:bCs w:val="false"/>
-                <w:color w:val="000000"/>
-                <w:sz w:val="20"/>
-                <w:szCs w:val="20"/>
-              </w:rPr>
-              <w:t xml:space="preserve">IPX800 V4</w:t>
-            </w:r>
-          </w:p>
-        </w:tc>
-        <w:tc>
-          <w:tcPr>
-            <w:tcW w:type="dxa" w:w="2400"/>
-            <w:tcBorders>
-              <w:top w:val="single" w:color="CCCCCC" w:sz="1"/>
-              <w:left w:val="single" w:color="CCCCCC" w:sz="1"/>
-              <w:bottom w:val="single" w:color="CCCCCC" w:sz="1"/>
-              <w:right w:val="single" w:color="CCCCCC" w:sz="1"/>
-            </w:tcBorders>
-            <w:shd w:fill="FFFFFF" w:val="clear"/>
-            <w:tcMar>
-              <w:top w:type="dxa" w:w="80"/>
-              <w:left w:type="dxa" w:w="150"/>
-              <w:bottom w:type="dxa" w:w="80"/>
-              <w:right w:type="dxa" w:w="150"/>
-            </w:tcMar>
-            <w:vAlign w:val="center"/>
-          </w:tcPr>
-          <w:p>
-            <w:pPr>
-              <w:jc w:val="left"/>
-            </w:pPr>
-            <w:r>
-              <w:rPr>
-                <w:rFonts w:ascii="Arial" w:cs="Arial" w:eastAsia="Arial" w:hAnsi="Arial"/>
-                <w:b w:val="false"/>
-                <w:bCs w:val="false"/>
-                <w:color w:val="000000"/>
-                <w:sz w:val="20"/>
-                <w:szCs w:val="20"/>
-              </w:rPr>
-              <w:t xml:space="preserve">Home LAN</w:t>
-            </w:r>
-          </w:p>
-        </w:tc>
-        <w:tc>
-          <w:tcPr>
-            <w:tcW w:type="dxa" w:w="5372"/>
-            <w:tcBorders>
-              <w:top w:val="single" w:color="CCCCCC" w:sz="1"/>
-              <w:left w:val="single" w:color="CCCCCC" w:sz="1"/>
-              <w:bottom w:val="single" w:color="CCCCCC" w:sz="1"/>
-              <w:right w:val="single" w:color="CCCCCC" w:sz="1"/>
-            </w:tcBorders>
-            <w:shd w:fill="FFFFFF" w:val="clear"/>
-            <w:tcMar>
-              <w:top w:type="dxa" w:w="80"/>
-              <w:left w:type="dxa" w:w="150"/>
-              <w:bottom w:type="dxa" w:w="80"/>
-              <w:right w:type="dxa" w:w="150"/>
-            </w:tcMar>
-            <w:vAlign w:val="center"/>
-          </w:tcPr>
-          <w:p>
-            <w:pPr>
-              <w:jc w:val="left"/>
-            </w:pPr>
-            <w:r>
-              <w:rPr>
-                <w:rFonts w:ascii="Arial" w:cs="Arial" w:eastAsia="Arial" w:hAnsi="Arial"/>
-                <w:b w:val="false"/>
-                <w:bCs w:val="false"/>
-                <w:color w:val="000000"/>
-                <w:sz w:val="20"/>
-                <w:szCs w:val="20"/>
-              </w:rPr>
-              <w:t xml:space="preserve">Fixed LAN IP (e.g. 192.168.1.100). Reachable from VPS via: http://xxx.duckdns.org:8080</w:t>
+              <w:t>Static LAN IP (e.g. 192.168.1.x, set in IPX800 Web UI). Reachable directly from VPS: http://&lt;IPX800-LAN-IP&gt;:80 -- no external exposure.</w:t>
             </w:r>
           </w:p>
         </w:tc>
@@ -9403,13 +9228,7 @@
         <w:ind w:left="360"/>
       </w:pPr>
       <w:r>
-        <w:rPr>
-          <w:rFonts w:ascii="Courier New" w:cs="Courier New" w:eastAsia="Courier New" w:hAnsi="Courier New"/>
-          <w:color w:val="1A1A1A"/>
-          <w:sz w:val="18"/>
-          <w:szCs w:val="18"/>
-        </w:rPr>
-        <w:t xml:space="preserve">  |  9. Resolve xxx.duckdns.org --&gt; home router public IP</w:t>
+        <w:t xml:space="preserve">  |  9. GET http://&lt;IPX800-LAN-IP&gt;:80/preset.htm?led1=1&amp;apikey=XXX</w:t>
       </w:r>
     </w:p>
     <w:p>
@@ -9419,13 +9238,7 @@
         <w:ind w:left="360"/>
       </w:pPr>
       <w:r>
-        <w:rPr>
-          <w:rFonts w:ascii="Courier New" w:cs="Courier New" w:eastAsia="Courier New" w:hAnsi="Courier New"/>
-          <w:color w:val="1A1A1A"/>
-          <w:sz w:val="18"/>
-          <w:szCs w:val="18"/>
-        </w:rPr>
-        <w:t xml:space="preserve">  |  10. GET http://xxx.duckdns.org:8080/preset.htm?led1=1&amp;apikey=XXX</w:t>
+        <w:t xml:space="preserve">  |     (direct LAN -- VPS and IPX800 on same network, no DDNS needed)</w:t>
       </w:r>
     </w:p>
     <w:p>
@@ -9435,13 +9248,7 @@
         <w:ind w:left="360"/>
       </w:pPr>
       <w:r>
-        <w:rPr>
-          <w:rFonts w:ascii="Courier New" w:cs="Courier New" w:eastAsia="Courier New" w:hAnsi="Courier New"/>
-          <w:color w:val="1A1A1A"/>
-          <w:sz w:val="18"/>
-          <w:szCs w:val="18"/>
-        </w:rPr>
-        <w:t xml:space="preserve">  |      --&gt; Router port-forwards 8080 to IPX800:80 on home LAN</w:t>
+        <w:t xml:space="preserve">  |  10. Read back /status.xml to confirm execution</w:t>
       </w:r>
     </w:p>
     <w:p>
@@ -9450,15 +9257,6 @@
         <w:spacing w:after="28" w:before="28"/>
         <w:ind w:left="360"/>
       </w:pPr>
-      <w:r>
-        <w:rPr>
-          <w:rFonts w:ascii="Courier New" w:cs="Courier New" w:eastAsia="Courier New" w:hAnsi="Courier New"/>
-          <w:color w:val="1A1A1A"/>
-          <w:sz w:val="18"/>
-          <w:szCs w:val="18"/>
-        </w:rPr>
-        <w:t xml:space="preserve">  |  11. Read back /status.xml to confirm execution</w:t>
-      </w:r>
     </w:p>
     <w:p>
       <w:pPr>
@@ -11145,15 +10943,7 @@
               <w:jc w:val="left"/>
             </w:pPr>
             <w:r>
-              <w:rPr>
-                <w:rFonts w:ascii="Arial" w:cs="Arial" w:eastAsia="Arial" w:hAnsi="Arial"/>
-                <w:b w:val="false"/>
-                <w:bCs w:val="false"/>
-                <w:color w:val="000000"/>
-                <w:sz w:val="20"/>
-                <w:szCs w:val="20"/>
-              </w:rPr>
-              <w:t xml:space="preserve">Async HTTP calls to IPX800 via DDNS hostname</w:t>
+              <w:t>Async HTTP calls to IPX800 via local LAN IP address (direct, no DDNS)</w:t>
             </w:r>
           </w:p>
         </w:tc>
@@ -11296,290 +11086,6 @@
                 <w:szCs w:val="20"/>
               </w:rPr>
               <w:t xml:space="preserve">WhatsApp Graph API calls</w:t>
-            </w:r>
-          </w:p>
-        </w:tc>
-      </w:tr>
-      <w:tr>
-        <w:tc>
-          <w:tcPr>
-            <w:tcW w:type="dxa" w:w="1200"/>
-            <w:tcBorders>
-              <w:top w:val="single" w:color="CCCCCC" w:sz="1"/>
-              <w:left w:val="single" w:color="CCCCCC" w:sz="1"/>
-              <w:bottom w:val="single" w:color="CCCCCC" w:sz="1"/>
-              <w:right w:val="single" w:color="CCCCCC" w:sz="1"/>
-            </w:tcBorders>
-            <w:shd w:fill="FFFFFF" w:val="clear"/>
-            <w:tcMar>
-              <w:top w:type="dxa" w:w="80"/>
-              <w:left w:type="dxa" w:w="150"/>
-              <w:bottom w:type="dxa" w:w="80"/>
-              <w:right w:type="dxa" w:w="150"/>
-            </w:tcMar>
-            <w:vAlign w:val="center"/>
-          </w:tcPr>
-          <w:p>
-            <w:pPr>
-              <w:jc w:val="left"/>
-            </w:pPr>
-            <w:r>
-              <w:rPr>
-                <w:rFonts w:ascii="Arial" w:cs="Arial" w:eastAsia="Arial" w:hAnsi="Arial"/>
-                <w:b w:val="false"/>
-                <w:bCs w:val="false"/>
-                <w:color w:val="000000"/>
-                <w:sz w:val="20"/>
-                <w:szCs w:val="20"/>
-              </w:rPr>
-              <w:t xml:space="preserve">DDNS</w:t>
-            </w:r>
-          </w:p>
-        </w:tc>
-        <w:tc>
-          <w:tcPr>
-            <w:tcW w:type="dxa" w:w="2000"/>
-            <w:tcBorders>
-              <w:top w:val="single" w:color="CCCCCC" w:sz="1"/>
-              <w:left w:val="single" w:color="CCCCCC" w:sz="1"/>
-              <w:bottom w:val="single" w:color="CCCCCC" w:sz="1"/>
-              <w:right w:val="single" w:color="CCCCCC" w:sz="1"/>
-            </w:tcBorders>
-            <w:shd w:fill="FFFFFF" w:val="clear"/>
-            <w:tcMar>
-              <w:top w:type="dxa" w:w="80"/>
-              <w:left w:type="dxa" w:w="150"/>
-              <w:bottom w:type="dxa" w:w="80"/>
-              <w:right w:type="dxa" w:w="150"/>
-            </w:tcMar>
-            <w:vAlign w:val="center"/>
-          </w:tcPr>
-          <w:p>
-            <w:pPr>
-              <w:jc w:val="left"/>
-            </w:pPr>
-            <w:r>
-              <w:rPr>
-                <w:rFonts w:ascii="Arial" w:cs="Arial" w:eastAsia="Arial" w:hAnsi="Arial"/>
-                <w:b w:val="false"/>
-                <w:bCs w:val="false"/>
-                <w:color w:val="000000"/>
-                <w:sz w:val="20"/>
-                <w:szCs w:val="20"/>
-              </w:rPr>
-              <w:t xml:space="preserve">DuckDNS</w:t>
-            </w:r>
-          </w:p>
-        </w:tc>
-        <w:tc>
-          <w:tcPr>
-            <w:tcW w:type="dxa" w:w="2200"/>
-            <w:tcBorders>
-              <w:top w:val="single" w:color="CCCCCC" w:sz="1"/>
-              <w:left w:val="single" w:color="CCCCCC" w:sz="1"/>
-              <w:bottom w:val="single" w:color="CCCCCC" w:sz="1"/>
-              <w:right w:val="single" w:color="CCCCCC" w:sz="1"/>
-            </w:tcBorders>
-            <w:shd w:fill="FFFFFF" w:val="clear"/>
-            <w:tcMar>
-              <w:top w:type="dxa" w:w="80"/>
-              <w:left w:type="dxa" w:w="150"/>
-              <w:bottom w:type="dxa" w:w="80"/>
-              <w:right w:type="dxa" w:w="150"/>
-            </w:tcMar>
-            <w:vAlign w:val="center"/>
-          </w:tcPr>
-          <w:p>
-            <w:pPr>
-              <w:jc w:val="left"/>
-            </w:pPr>
-            <w:r>
-              <w:rPr>
-                <w:rFonts w:ascii="Arial" w:cs="Arial" w:eastAsia="Arial" w:hAnsi="Arial"/>
-                <w:b w:val="false"/>
-                <w:bCs w:val="false"/>
-                <w:color w:val="000000"/>
-                <w:sz w:val="20"/>
-                <w:szCs w:val="20"/>
-              </w:rPr>
-              <w:t xml:space="preserve">Free</w:t>
-            </w:r>
-          </w:p>
-        </w:tc>
-        <w:tc>
-          <w:tcPr>
-            <w:tcW w:type="dxa" w:w="4572"/>
-            <w:tcBorders>
-              <w:top w:val="single" w:color="CCCCCC" w:sz="1"/>
-              <w:left w:val="single" w:color="CCCCCC" w:sz="1"/>
-              <w:bottom w:val="single" w:color="CCCCCC" w:sz="1"/>
-              <w:right w:val="single" w:color="CCCCCC" w:sz="1"/>
-            </w:tcBorders>
-            <w:shd w:fill="FFFFFF" w:val="clear"/>
-            <w:tcMar>
-              <w:top w:type="dxa" w:w="80"/>
-              <w:left w:type="dxa" w:w="150"/>
-              <w:bottom w:type="dxa" w:w="80"/>
-              <w:right w:type="dxa" w:w="150"/>
-            </w:tcMar>
-            <w:vAlign w:val="center"/>
-          </w:tcPr>
-          <w:p>
-            <w:pPr>
-              <w:jc w:val="left"/>
-            </w:pPr>
-            <w:r>
-              <w:rPr>
-                <w:rFonts w:ascii="Arial" w:cs="Arial" w:eastAsia="Arial" w:hAnsi="Arial"/>
-                <w:b w:val="false"/>
-                <w:bCs w:val="false"/>
-                <w:color w:val="000000"/>
-                <w:sz w:val="20"/>
-                <w:szCs w:val="20"/>
-              </w:rPr>
-              <w:t xml:space="preserve">Maps dynamic home IP to fixed hostname xxx.duckdns.org</w:t>
-            </w:r>
-          </w:p>
-        </w:tc>
-      </w:tr>
-      <w:tr>
-        <w:tc>
-          <w:tcPr>
-            <w:tcW w:type="dxa" w:w="1200"/>
-            <w:tcBorders>
-              <w:top w:val="single" w:color="CCCCCC" w:sz="1"/>
-              <w:left w:val="single" w:color="CCCCCC" w:sz="1"/>
-              <w:bottom w:val="single" w:color="CCCCCC" w:sz="1"/>
-              <w:right w:val="single" w:color="CCCCCC" w:sz="1"/>
-            </w:tcBorders>
-            <w:shd w:fill="F5F9FF" w:val="clear"/>
-            <w:tcMar>
-              <w:top w:type="dxa" w:w="80"/>
-              <w:left w:type="dxa" w:w="150"/>
-              <w:bottom w:type="dxa" w:w="80"/>
-              <w:right w:type="dxa" w:w="150"/>
-            </w:tcMar>
-            <w:vAlign w:val="center"/>
-          </w:tcPr>
-          <w:p>
-            <w:pPr>
-              <w:jc w:val="left"/>
-            </w:pPr>
-            <w:r>
-              <w:rPr>
-                <w:rFonts w:ascii="Arial" w:cs="Arial" w:eastAsia="Arial" w:hAnsi="Arial"/>
-                <w:b w:val="false"/>
-                <w:bCs w:val="false"/>
-                <w:color w:val="000000"/>
-                <w:sz w:val="20"/>
-                <w:szCs w:val="20"/>
-              </w:rPr>
-              <w:t xml:space="preserve">Port Forwarding</w:t>
-            </w:r>
-          </w:p>
-        </w:tc>
-        <w:tc>
-          <w:tcPr>
-            <w:tcW w:type="dxa" w:w="2000"/>
-            <w:tcBorders>
-              <w:top w:val="single" w:color="CCCCCC" w:sz="1"/>
-              <w:left w:val="single" w:color="CCCCCC" w:sz="1"/>
-              <w:bottom w:val="single" w:color="CCCCCC" w:sz="1"/>
-              <w:right w:val="single" w:color="CCCCCC" w:sz="1"/>
-            </w:tcBorders>
-            <w:shd w:fill="F5F9FF" w:val="clear"/>
-            <w:tcMar>
-              <w:top w:type="dxa" w:w="80"/>
-              <w:left w:type="dxa" w:w="150"/>
-              <w:bottom w:type="dxa" w:w="80"/>
-              <w:right w:type="dxa" w:w="150"/>
-            </w:tcMar>
-            <w:vAlign w:val="center"/>
-          </w:tcPr>
-          <w:p>
-            <w:pPr>
-              <w:jc w:val="left"/>
-            </w:pPr>
-            <w:r>
-              <w:rPr>
-                <w:rFonts w:ascii="Arial" w:cs="Arial" w:eastAsia="Arial" w:hAnsi="Arial"/>
-                <w:b w:val="false"/>
-                <w:bCs w:val="false"/>
-                <w:color w:val="000000"/>
-                <w:sz w:val="20"/>
-                <w:szCs w:val="20"/>
-              </w:rPr>
-              <w:t xml:space="preserve">Home Router</w:t>
-            </w:r>
-          </w:p>
-        </w:tc>
-        <w:tc>
-          <w:tcPr>
-            <w:tcW w:type="dxa" w:w="2200"/>
-            <w:tcBorders>
-              <w:top w:val="single" w:color="CCCCCC" w:sz="1"/>
-              <w:left w:val="single" w:color="CCCCCC" w:sz="1"/>
-              <w:bottom w:val="single" w:color="CCCCCC" w:sz="1"/>
-              <w:right w:val="single" w:color="CCCCCC" w:sz="1"/>
-            </w:tcBorders>
-            <w:shd w:fill="F5F9FF" w:val="clear"/>
-            <w:tcMar>
-              <w:top w:type="dxa" w:w="80"/>
-              <w:left w:type="dxa" w:w="150"/>
-              <w:bottom w:type="dxa" w:w="80"/>
-              <w:right w:type="dxa" w:w="150"/>
-            </w:tcMar>
-            <w:vAlign w:val="center"/>
-          </w:tcPr>
-          <w:p>
-            <w:pPr>
-              <w:jc w:val="left"/>
-            </w:pPr>
-            <w:r>
-              <w:rPr>
-                <w:rFonts w:ascii="Arial" w:cs="Arial" w:eastAsia="Arial" w:hAnsi="Arial"/>
-                <w:b w:val="false"/>
-                <w:bCs w:val="false"/>
-                <w:color w:val="000000"/>
-                <w:sz w:val="20"/>
-                <w:szCs w:val="20"/>
-              </w:rPr>
-              <w:t xml:space="preserve">Router-dependent</w:t>
-            </w:r>
-          </w:p>
-        </w:tc>
-        <w:tc>
-          <w:tcPr>
-            <w:tcW w:type="dxa" w:w="4572"/>
-            <w:tcBorders>
-              <w:top w:val="single" w:color="CCCCCC" w:sz="1"/>
-              <w:left w:val="single" w:color="CCCCCC" w:sz="1"/>
-              <w:bottom w:val="single" w:color="CCCCCC" w:sz="1"/>
-              <w:right w:val="single" w:color="CCCCCC" w:sz="1"/>
-            </w:tcBorders>
-            <w:shd w:fill="F5F9FF" w:val="clear"/>
-            <w:tcMar>
-              <w:top w:type="dxa" w:w="80"/>
-              <w:left w:type="dxa" w:w="150"/>
-              <w:bottom w:type="dxa" w:w="80"/>
-              <w:right w:type="dxa" w:w="150"/>
-            </w:tcMar>
-            <w:vAlign w:val="center"/>
-          </w:tcPr>
-          <w:p>
-            <w:pPr>
-              <w:jc w:val="left"/>
-            </w:pPr>
-            <w:r>
-              <w:rPr>
-                <w:rFonts w:ascii="Arial" w:cs="Arial" w:eastAsia="Arial" w:hAnsi="Arial"/>
-                <w:b w:val="false"/>
-                <w:bCs w:val="false"/>
-                <w:color w:val="000000"/>
-                <w:sz w:val="20"/>
-                <w:szCs w:val="20"/>
-              </w:rPr>
-              <w:t xml:space="preserve">Forwards public port 8080 → IPX800 LAN IP:80. ACL limits source to VPS IP.</w:t>
             </w:r>
           </w:p>
         </w:tc>
@@ -13251,13 +12757,7 @@
         <w:spacing w:after="80" w:before="80"/>
       </w:pPr>
       <w:r>
-        <w:rPr>
-          <w:rFonts w:ascii="Arial" w:cs="Arial" w:eastAsia="Arial" w:hAnsi="Arial"/>
-          <w:color w:val="222222"/>
-          <w:sz w:val="22"/>
-          <w:szCs w:val="22"/>
-        </w:rPr>
-        <w:t xml:space="preserve">The Python FastAPI service handles all hardware interaction. It is an internal service called by Node.js. It reaches the IPX800 via the DDNS hostname and port forwarding — not directly via LAN IP.</w:t>
+        <w:t>The Python FastAPI service handles all hardware interaction. It is an internal service called by Node.js. It reaches the IPX800 directly via its local LAN IP address -- no DDNS or port forwarding needed since VPS and IPX800 share the same LAN.</w:t>
       </w:r>
     </w:p>
     <w:p>
@@ -13487,15 +12987,7 @@
               <w:jc w:val="left"/>
             </w:pPr>
             <w:r>
-              <w:rPr>
-                <w:rFonts w:ascii="Arial" w:cs="Arial" w:eastAsia="Arial" w:hAnsi="Arial"/>
-                <w:b w:val="false"/>
-                <w:bCs w:val="false"/>
-                <w:color w:val="000000"/>
-                <w:sz w:val="20"/>
-                <w:szCs w:val="20"/>
-              </w:rPr>
-              <w:t xml:space="preserve">Receives command from Node.js, maps to relay number, calls IPX800 via DDNS hostname, returns result</w:t>
+              <w:t>Receives command from Node.js, maps to relay number, calls IPX800 via local LAN IP, applies curtain interlock if needed, returns reply text and success flag</w:t>
             </w:r>
           </w:p>
         </w:tc>
@@ -13524,15 +13016,7 @@
               <w:jc w:val="left"/>
             </w:pPr>
             <w:r>
-              <w:rPr>
-                <w:rFonts w:ascii="Arial" w:cs="Arial" w:eastAsia="Arial" w:hAnsi="Arial"/>
-                <w:b w:val="false"/>
-                <w:bCs w:val="false"/>
-                <w:color w:val="000000"/>
-                <w:sz w:val="20"/>
-                <w:szCs w:val="20"/>
-              </w:rPr>
-              <w:t xml:space="preserve">GET /status</w:t>
+              <w:t>GET /health</w:t>
             </w:r>
           </w:p>
         </w:tc>
@@ -13559,15 +13043,7 @@
               <w:jc w:val="left"/>
             </w:pPr>
             <w:r>
-              <w:rPr>
-                <w:rFonts w:ascii="Arial" w:cs="Arial" w:eastAsia="Arial" w:hAnsi="Arial"/>
-                <w:b w:val="false"/>
-                <w:bCs w:val="false"/>
-                <w:color w:val="000000"/>
-                <w:sz w:val="20"/>
-                <w:szCs w:val="20"/>
-              </w:rPr>
-              <w:t xml:space="preserve">Queries IPX800 status.xml via DDNS hostname, parses XML, returns structured JSON</w:t>
+              <w:t>Pings IPX800 to check reachability via local LAN IP; returns structured JSON health report with ipx800_host, ipx800_port, and reachability status</w:t>
             </w:r>
           </w:p>
         </w:tc>
@@ -13775,15 +13251,7 @@
               <w:jc w:val="left"/>
             </w:pPr>
             <w:r>
-              <w:rPr>
-                <w:rFonts w:ascii="Arial" w:cs="Arial" w:eastAsia="Arial" w:hAnsi="Arial"/>
-                <w:b w:val="false"/>
-                <w:bCs w:val="false"/>
-                <w:color w:val="000000"/>
-                <w:sz w:val="20"/>
-                <w:szCs w:val="20"/>
-              </w:rPr>
-              <w:t xml:space="preserve">Loads IPX800_HOST (xxx.duckdns.org), IPX800_PORT (8080), IPX800_APIKEY, relay mappings from .env</w:t>
+              <w:t>Loads IPX800_HOST (&lt;IPX800-LAN-IP&gt;), IPX800_PORT (80), IPX800_APIKEY, relay mapping (RELAY_LIGHT, RELAY_CURTAIN_UP, RELAY_CURTAIN_DOWN), and log settings from fastapi/.env</w:t>
             </w:r>
           </w:p>
         </w:tc>
@@ -13919,15 +13387,7 @@
               <w:jc w:val="left"/>
             </w:pPr>
             <w:r>
-              <w:rPr>
-                <w:rFonts w:ascii="Arial" w:cs="Arial" w:eastAsia="Arial" w:hAnsi="Arial"/>
-                <w:b w:val="false"/>
-                <w:bCs w:val="false"/>
-                <w:color w:val="000000"/>
-                <w:sz w:val="20"/>
-                <w:szCs w:val="20"/>
-              </w:rPr>
-              <w:t xml:space="preserve">3 attempts with 10s delay — covers DDNS lag after home IP change (up to 5 min propagation)</w:t>
+              <w:t>3 attempts with 10 s delay -- covers transient LAN errors. After all retries exhausted, returns success:false to Node.js which sends an error reply to the user.</w:t>
             </w:r>
           </w:p>
         </w:tc>
@@ -15029,15 +14489,7 @@
               <w:jc w:val="center"/>
             </w:pPr>
             <w:r>
-              <w:rPr>
-                <w:rFonts w:ascii="Arial" w:cs="Arial" w:eastAsia="Arial" w:hAnsi="Arial"/>
-                <w:b/>
-                <w:bCs/>
-                <w:color w:val="FFFFFF"/>
-                <w:sz w:val="22"/>
-                <w:szCs w:val="22"/>
-              </w:rPr>
-              <w:t xml:space="preserve">P-01</w:t>
+              <w:t>P-01</w:t>
             </w:r>
           </w:p>
         </w:tc>
@@ -15050,29 +14502,21 @@
               <w:bottom w:val="single" w:color="CCCCCC" w:sz="1"/>
               <w:right w:val="single" w:color="CCCCCC" w:sz="1"/>
             </w:tcBorders>
-            <w:shd w:fill="F5F9FF" w:val="clear"/>
-            <w:tcMar>
-              <w:top w:type="dxa" w:w="80"/>
-              <w:left w:type="dxa" w:w="150"/>
-              <w:bottom w:type="dxa" w:w="80"/>
-              <w:right w:type="dxa" w:w="150"/>
-            </w:tcMar>
-            <w:vAlign w:val="center"/>
-          </w:tcPr>
-          <w:p>
-            <w:pPr>
-              <w:jc w:val="left"/>
-            </w:pPr>
-            <w:r>
-              <w:rPr>
-                <w:rFonts w:ascii="Arial" w:cs="Arial" w:eastAsia="Arial" w:hAnsi="Arial"/>
-                <w:b/>
-                <w:bCs/>
-                <w:color w:val="1F4E79"/>
-                <w:sz w:val="20"/>
-                <w:szCs w:val="20"/>
-              </w:rPr>
-              <w:t xml:space="preserve">Real public IP on home router (NOT CG-NAT)</w:t>
+            <w:shd w:fill="FFFFFF" w:val="clear"/>
+            <w:tcMar>
+              <w:top w:type="dxa" w:w="80"/>
+              <w:left w:type="dxa" w:w="150"/>
+              <w:bottom w:type="dxa" w:w="80"/>
+              <w:right w:type="dxa" w:w="150"/>
+            </w:tcMar>
+            <w:vAlign w:val="center"/>
+          </w:tcPr>
+          <w:p>
+            <w:pPr>
+              <w:jc w:val="left"/>
+            </w:pPr>
+            <w:r>
+              <w:t>VPS and IPX800 on the same LAN -- static IP on IPX800</w:t>
             </w:r>
           </w:p>
         </w:tc>
@@ -15085,29 +14529,21 @@
               <w:bottom w:val="single" w:color="CCCCCC" w:sz="1"/>
               <w:right w:val="single" w:color="CCCCCC" w:sz="1"/>
             </w:tcBorders>
-            <w:shd w:fill="F5F9FF" w:val="clear"/>
-            <w:tcMar>
-              <w:top w:type="dxa" w:w="80"/>
-              <w:left w:type="dxa" w:w="150"/>
-              <w:bottom w:type="dxa" w:w="80"/>
-              <w:right w:type="dxa" w:w="150"/>
-            </w:tcMar>
-            <w:vAlign w:val="center"/>
-          </w:tcPr>
-          <w:p>
-            <w:pPr>
-              <w:jc w:val="left"/>
-            </w:pPr>
-            <w:r>
-              <w:rPr>
-                <w:rFonts w:ascii="Arial" w:cs="Arial" w:eastAsia="Arial" w:hAnsi="Arial"/>
-                <w:b w:val="false"/>
-                <w:bCs w:val="false"/>
-                <w:color w:val="000000"/>
-                <w:sz w:val="20"/>
-                <w:szCs w:val="20"/>
-              </w:rPr>
-              <w:t xml:space="preserve">Run curl ifconfig.me on a home device. Compare with router WAN IP. They must match. If behind CG-NAT, Option A (port forwarding) will not work — escalate to frp tunnel.</w:t>
+            <w:shd w:fill="FFFFFF" w:val="clear"/>
+            <w:tcMar>
+              <w:top w:type="dxa" w:w="80"/>
+              <w:left w:type="dxa" w:w="150"/>
+              <w:bottom w:type="dxa" w:w="80"/>
+              <w:right w:type="dxa" w:w="150"/>
+            </w:tcMar>
+            <w:vAlign w:val="center"/>
+          </w:tcPr>
+          <w:p>
+            <w:pPr>
+              <w:jc w:val="left"/>
+            </w:pPr>
+            <w:r>
+              <w:t>Verify both are on the same network segment. Assign IPX800 a static LAN IP in its Web UI (Network &gt; Parameters &gt; disable DHCP). No DDNS or port forwarding needed.</w:t>
             </w:r>
           </w:p>
         </w:tc>
@@ -15136,15 +14572,7 @@
               <w:jc w:val="center"/>
             </w:pPr>
             <w:r>
-              <w:rPr>
-                <w:rFonts w:ascii="Arial" w:cs="Arial" w:eastAsia="Arial" w:hAnsi="Arial"/>
-                <w:b/>
-                <w:bCs/>
-                <w:color w:val="FFFFFF"/>
-                <w:sz w:val="22"/>
-                <w:szCs w:val="22"/>
-              </w:rPr>
-              <w:t xml:space="preserve">P-02</w:t>
+              <w:t>P-02</w:t>
             </w:r>
           </w:p>
         </w:tc>
@@ -15157,7 +14585,7 @@
               <w:bottom w:val="single" w:color="CCCCCC" w:sz="1"/>
               <w:right w:val="single" w:color="CCCCCC" w:sz="1"/>
             </w:tcBorders>
-            <w:shd w:fill="FFFFFF" w:val="clear"/>
+            <w:shd w:fill="F5F9FF" w:val="clear"/>
             <w:tcMar>
               <w:top w:type="dxa" w:w="80"/>
               <w:left w:type="dxa" w:w="150"/>
@@ -15179,7 +14607,7 @@
                 <w:sz w:val="20"/>
                 <w:szCs w:val="20"/>
               </w:rPr>
-              <w:t xml:space="preserve">Router supports port forwarding</w:t>
+              <w:t xml:space="preserve">VPS public domain name</w:t>
             </w:r>
           </w:p>
         </w:tc>
@@ -15192,29 +14620,29 @@
               <w:bottom w:val="single" w:color="CCCCCC" w:sz="1"/>
               <w:right w:val="single" w:color="CCCCCC" w:sz="1"/>
             </w:tcBorders>
-            <w:shd w:fill="FFFFFF" w:val="clear"/>
-            <w:tcMar>
-              <w:top w:type="dxa" w:w="80"/>
-              <w:left w:type="dxa" w:w="150"/>
-              <w:bottom w:type="dxa" w:w="80"/>
-              <w:right w:type="dxa" w:w="150"/>
-            </w:tcMar>
-            <w:vAlign w:val="center"/>
-          </w:tcPr>
-          <w:p>
-            <w:pPr>
-              <w:jc w:val="left"/>
-            </w:pPr>
-            <w:r>
-              <w:rPr>
-                <w:rFonts w:ascii="Arial" w:cs="Arial" w:eastAsia="Arial" w:hAnsi="Arial"/>
-                <w:b w:val="false"/>
-                <w:bCs w:val="false"/>
-                <w:color w:val="000000"/>
-                <w:sz w:val="20"/>
-                <w:szCs w:val="20"/>
-              </w:rPr>
-              <w:t xml:space="preserve">Access router admin page. Confirm there is a port forwarding or NAT section. Create rule: TCP 8080 external → 192.168.1.100:80 internal. Restrict source IP to VPS public IP for security.</w:t>
+            <w:shd w:fill="F5F9FF" w:val="clear"/>
+            <w:tcMar>
+              <w:top w:type="dxa" w:w="80"/>
+              <w:left w:type="dxa" w:w="150"/>
+              <w:bottom w:type="dxa" w:w="80"/>
+              <w:right w:type="dxa" w:w="150"/>
+            </w:tcMar>
+            <w:vAlign w:val="center"/>
+          </w:tcPr>
+          <w:p>
+            <w:pPr>
+              <w:jc w:val="left"/>
+            </w:pPr>
+            <w:r>
+              <w:rPr>
+                <w:rFonts w:ascii="Arial" w:cs="Arial" w:eastAsia="Arial" w:hAnsi="Arial"/>
+                <w:b w:val="false"/>
+                <w:bCs w:val="false"/>
+                <w:color w:val="000000"/>
+                <w:sz w:val="20"/>
+                <w:szCs w:val="20"/>
+              </w:rPr>
+              <w:t xml:space="preserve">A domain (e.g. yourdomain.com) with DNS A record pointing to VPS public IP. Required for Meta Webhook (must be HTTPS). Note: this is different from the DuckDNS hostname used for IPX800.</w:t>
             </w:r>
           </w:p>
         </w:tc>
@@ -15243,15 +14671,7 @@
               <w:jc w:val="center"/>
             </w:pPr>
             <w:r>
-              <w:rPr>
-                <w:rFonts w:ascii="Arial" w:cs="Arial" w:eastAsia="Arial" w:hAnsi="Arial"/>
-                <w:b/>
-                <w:bCs/>
-                <w:color w:val="FFFFFF"/>
-                <w:sz w:val="22"/>
-                <w:szCs w:val="22"/>
-              </w:rPr>
-              <w:t xml:space="preserve">P-03</w:t>
+              <w:t>P-03</w:t>
             </w:r>
           </w:p>
         </w:tc>
@@ -15264,7 +14684,7 @@
               <w:bottom w:val="single" w:color="CCCCCC" w:sz="1"/>
               <w:right w:val="single" w:color="CCCCCC" w:sz="1"/>
             </w:tcBorders>
-            <w:shd w:fill="F5F9FF" w:val="clear"/>
+            <w:shd w:fill="FFFFFF" w:val="clear"/>
             <w:tcMar>
               <w:top w:type="dxa" w:w="80"/>
               <w:left w:type="dxa" w:w="150"/>
@@ -15286,7 +14706,7 @@
                 <w:sz w:val="20"/>
                 <w:szCs w:val="20"/>
               </w:rPr>
-              <w:t xml:space="preserve">DuckDNS account and subdomain</w:t>
+              <w:t xml:space="preserve">Port 443 open on VPS firewall</w:t>
             </w:r>
           </w:p>
         </w:tc>
@@ -15299,29 +14719,29 @@
               <w:bottom w:val="single" w:color="CCCCCC" w:sz="1"/>
               <w:right w:val="single" w:color="CCCCCC" w:sz="1"/>
             </w:tcBorders>
-            <w:shd w:fill="F5F9FF" w:val="clear"/>
-            <w:tcMar>
-              <w:top w:type="dxa" w:w="80"/>
-              <w:left w:type="dxa" w:w="150"/>
-              <w:bottom w:type="dxa" w:w="80"/>
-              <w:right w:type="dxa" w:w="150"/>
-            </w:tcMar>
-            <w:vAlign w:val="center"/>
-          </w:tcPr>
-          <w:p>
-            <w:pPr>
-              <w:jc w:val="left"/>
-            </w:pPr>
-            <w:r>
-              <w:rPr>
-                <w:rFonts w:ascii="Arial" w:cs="Arial" w:eastAsia="Arial" w:hAnsi="Arial"/>
-                <w:b w:val="false"/>
-                <w:bCs w:val="false"/>
-                <w:color w:val="000000"/>
-                <w:sz w:val="20"/>
-                <w:szCs w:val="20"/>
-              </w:rPr>
-              <w:t xml:space="preserve">Register free at duckdns.org. Create subdomain (e.g. myhome.duckdns.org). Token available in dashboard. Configure router DDNS client or deploy cron script to update every 5 minutes.</w:t>
+            <w:shd w:fill="FFFFFF" w:val="clear"/>
+            <w:tcMar>
+              <w:top w:type="dxa" w:w="80"/>
+              <w:left w:type="dxa" w:w="150"/>
+              <w:bottom w:type="dxa" w:w="80"/>
+              <w:right w:type="dxa" w:w="150"/>
+            </w:tcMar>
+            <w:vAlign w:val="center"/>
+          </w:tcPr>
+          <w:p>
+            <w:pPr>
+              <w:jc w:val="left"/>
+            </w:pPr>
+            <w:r>
+              <w:rPr>
+                <w:rFonts w:ascii="Arial" w:cs="Arial" w:eastAsia="Arial" w:hAnsi="Arial"/>
+                <w:b w:val="false"/>
+                <w:bCs w:val="false"/>
+                <w:color w:val="000000"/>
+                <w:sz w:val="20"/>
+                <w:szCs w:val="20"/>
+              </w:rPr>
+              <w:t xml:space="preserve">ufw allow 443. Meta Webhook only accepts HTTPS on standard port 443.</w:t>
             </w:r>
           </w:p>
         </w:tc>
@@ -15350,336 +14770,7 @@
               <w:jc w:val="center"/>
             </w:pPr>
             <w:r>
-              <w:rPr>
-                <w:rFonts w:ascii="Arial" w:cs="Arial" w:eastAsia="Arial" w:hAnsi="Arial"/>
-                <w:b/>
-                <w:bCs/>
-                <w:color w:val="FFFFFF"/>
-                <w:sz w:val="22"/>
-                <w:szCs w:val="22"/>
-              </w:rPr>
-              <w:t xml:space="preserve">P-04</w:t>
-            </w:r>
-          </w:p>
-        </w:tc>
-        <w:tc>
-          <w:tcPr>
-            <w:tcW w:type="dxa" w:w="3000"/>
-            <w:tcBorders>
-              <w:top w:val="single" w:color="CCCCCC" w:sz="1"/>
-              <w:left w:val="single" w:color="CCCCCC" w:sz="1"/>
-              <w:bottom w:val="single" w:color="CCCCCC" w:sz="1"/>
-              <w:right w:val="single" w:color="CCCCCC" w:sz="1"/>
-            </w:tcBorders>
-            <w:shd w:fill="FFFFFF" w:val="clear"/>
-            <w:tcMar>
-              <w:top w:type="dxa" w:w="80"/>
-              <w:left w:type="dxa" w:w="150"/>
-              <w:bottom w:type="dxa" w:w="80"/>
-              <w:right w:type="dxa" w:w="150"/>
-            </w:tcMar>
-            <w:vAlign w:val="center"/>
-          </w:tcPr>
-          <w:p>
-            <w:pPr>
-              <w:jc w:val="left"/>
-            </w:pPr>
-            <w:r>
-              <w:rPr>
-                <w:rFonts w:ascii="Arial" w:cs="Arial" w:eastAsia="Arial" w:hAnsi="Arial"/>
-                <w:b/>
-                <w:bCs/>
-                <w:color w:val="1F4E79"/>
-                <w:sz w:val="20"/>
-                <w:szCs w:val="20"/>
-              </w:rPr>
-              <w:t xml:space="preserve">IPX800 assigned a fixed LAN IP</w:t>
-            </w:r>
-          </w:p>
-        </w:tc>
-        <w:tc>
-          <w:tcPr>
-            <w:tcW w:type="dxa" w:w="6452"/>
-            <w:tcBorders>
-              <w:top w:val="single" w:color="CCCCCC" w:sz="1"/>
-              <w:left w:val="single" w:color="CCCCCC" w:sz="1"/>
-              <w:bottom w:val="single" w:color="CCCCCC" w:sz="1"/>
-              <w:right w:val="single" w:color="CCCCCC" w:sz="1"/>
-            </w:tcBorders>
-            <w:shd w:fill="FFFFFF" w:val="clear"/>
-            <w:tcMar>
-              <w:top w:type="dxa" w:w="80"/>
-              <w:left w:type="dxa" w:w="150"/>
-              <w:bottom w:type="dxa" w:w="80"/>
-              <w:right w:type="dxa" w:w="150"/>
-            </w:tcMar>
-            <w:vAlign w:val="center"/>
-          </w:tcPr>
-          <w:p>
-            <w:pPr>
-              <w:jc w:val="left"/>
-            </w:pPr>
-            <w:r>
-              <w:rPr>
-                <w:rFonts w:ascii="Arial" w:cs="Arial" w:eastAsia="Arial" w:hAnsi="Arial"/>
-                <w:b w:val="false"/>
-                <w:bCs w:val="false"/>
-                <w:color w:val="000000"/>
-                <w:sz w:val="20"/>
-                <w:szCs w:val="20"/>
-              </w:rPr>
-              <w:t xml:space="preserve">Set static IP in IPX800 Web UI (Network &gt; Parameters &gt; disable DHCP &gt; set IP). Alternatively use DHCP reservation by MAC address in router. Dynamic LAN IP would break port forwarding target.</w:t>
-            </w:r>
-          </w:p>
-        </w:tc>
-      </w:tr>
-      <w:tr>
-        <w:tc>
-          <w:tcPr>
-            <w:tcW w:type="dxa" w:w="520"/>
-            <w:tcBorders>
-              <w:top w:val="single" w:color="2E75B6" w:sz="1"/>
-              <w:left w:val="single" w:color="2E75B6" w:sz="1"/>
-              <w:bottom w:val="single" w:color="2E75B6" w:sz="1"/>
-              <w:right w:val="single" w:color="2E75B6" w:sz="1"/>
-            </w:tcBorders>
-            <w:shd w:fill="2E75B6" w:val="clear"/>
-            <w:tcMar>
-              <w:top w:type="dxa" w:w="80"/>
-              <w:left w:type="dxa" w:w="80"/>
-              <w:bottom w:type="dxa" w:w="80"/>
-              <w:right w:type="dxa" w:w="80"/>
-            </w:tcMar>
-            <w:vAlign w:val="center"/>
-          </w:tcPr>
-          <w:p>
-            <w:pPr>
-              <w:jc w:val="center"/>
-            </w:pPr>
-            <w:r>
-              <w:rPr>
-                <w:rFonts w:ascii="Arial" w:cs="Arial" w:eastAsia="Arial" w:hAnsi="Arial"/>
-                <w:b/>
-                <w:bCs/>
-                <w:color w:val="FFFFFF"/>
-                <w:sz w:val="22"/>
-                <w:szCs w:val="22"/>
-              </w:rPr>
-              <w:t xml:space="preserve">P-05</w:t>
-            </w:r>
-          </w:p>
-        </w:tc>
-        <w:tc>
-          <w:tcPr>
-            <w:tcW w:type="dxa" w:w="3000"/>
-            <w:tcBorders>
-              <w:top w:val="single" w:color="CCCCCC" w:sz="1"/>
-              <w:left w:val="single" w:color="CCCCCC" w:sz="1"/>
-              <w:bottom w:val="single" w:color="CCCCCC" w:sz="1"/>
-              <w:right w:val="single" w:color="CCCCCC" w:sz="1"/>
-            </w:tcBorders>
-            <w:shd w:fill="F5F9FF" w:val="clear"/>
-            <w:tcMar>
-              <w:top w:type="dxa" w:w="80"/>
-              <w:left w:type="dxa" w:w="150"/>
-              <w:bottom w:type="dxa" w:w="80"/>
-              <w:right w:type="dxa" w:w="150"/>
-            </w:tcMar>
-            <w:vAlign w:val="center"/>
-          </w:tcPr>
-          <w:p>
-            <w:pPr>
-              <w:jc w:val="left"/>
-            </w:pPr>
-            <w:r>
-              <w:rPr>
-                <w:rFonts w:ascii="Arial" w:cs="Arial" w:eastAsia="Arial" w:hAnsi="Arial"/>
-                <w:b/>
-                <w:bCs/>
-                <w:color w:val="1F4E79"/>
-                <w:sz w:val="20"/>
-                <w:szCs w:val="20"/>
-              </w:rPr>
-              <w:t xml:space="preserve">VPS public domain name</w:t>
-            </w:r>
-          </w:p>
-        </w:tc>
-        <w:tc>
-          <w:tcPr>
-            <w:tcW w:type="dxa" w:w="6452"/>
-            <w:tcBorders>
-              <w:top w:val="single" w:color="CCCCCC" w:sz="1"/>
-              <w:left w:val="single" w:color="CCCCCC" w:sz="1"/>
-              <w:bottom w:val="single" w:color="CCCCCC" w:sz="1"/>
-              <w:right w:val="single" w:color="CCCCCC" w:sz="1"/>
-            </w:tcBorders>
-            <w:shd w:fill="F5F9FF" w:val="clear"/>
-            <w:tcMar>
-              <w:top w:type="dxa" w:w="80"/>
-              <w:left w:type="dxa" w:w="150"/>
-              <w:bottom w:type="dxa" w:w="80"/>
-              <w:right w:type="dxa" w:w="150"/>
-            </w:tcMar>
-            <w:vAlign w:val="center"/>
-          </w:tcPr>
-          <w:p>
-            <w:pPr>
-              <w:jc w:val="left"/>
-            </w:pPr>
-            <w:r>
-              <w:rPr>
-                <w:rFonts w:ascii="Arial" w:cs="Arial" w:eastAsia="Arial" w:hAnsi="Arial"/>
-                <w:b w:val="false"/>
-                <w:bCs w:val="false"/>
-                <w:color w:val="000000"/>
-                <w:sz w:val="20"/>
-                <w:szCs w:val="20"/>
-              </w:rPr>
-              <w:t xml:space="preserve">A domain (e.g. yourdomain.com) with DNS A record pointing to VPS public IP. Required for Meta Webhook (must be HTTPS). Note: this is different from the DuckDNS hostname used for IPX800.</w:t>
-            </w:r>
-          </w:p>
-        </w:tc>
-      </w:tr>
-      <w:tr>
-        <w:tc>
-          <w:tcPr>
-            <w:tcW w:type="dxa" w:w="520"/>
-            <w:tcBorders>
-              <w:top w:val="single" w:color="2E75B6" w:sz="1"/>
-              <w:left w:val="single" w:color="2E75B6" w:sz="1"/>
-              <w:bottom w:val="single" w:color="2E75B6" w:sz="1"/>
-              <w:right w:val="single" w:color="2E75B6" w:sz="1"/>
-            </w:tcBorders>
-            <w:shd w:fill="2E75B6" w:val="clear"/>
-            <w:tcMar>
-              <w:top w:type="dxa" w:w="80"/>
-              <w:left w:type="dxa" w:w="80"/>
-              <w:bottom w:type="dxa" w:w="80"/>
-              <w:right w:type="dxa" w:w="80"/>
-            </w:tcMar>
-            <w:vAlign w:val="center"/>
-          </w:tcPr>
-          <w:p>
-            <w:pPr>
-              <w:jc w:val="center"/>
-            </w:pPr>
-            <w:r>
-              <w:rPr>
-                <w:rFonts w:ascii="Arial" w:cs="Arial" w:eastAsia="Arial" w:hAnsi="Arial"/>
-                <w:b/>
-                <w:bCs/>
-                <w:color w:val="FFFFFF"/>
-                <w:sz w:val="22"/>
-                <w:szCs w:val="22"/>
-              </w:rPr>
-              <w:t xml:space="preserve">P-06</w:t>
-            </w:r>
-          </w:p>
-        </w:tc>
-        <w:tc>
-          <w:tcPr>
-            <w:tcW w:type="dxa" w:w="3000"/>
-            <w:tcBorders>
-              <w:top w:val="single" w:color="CCCCCC" w:sz="1"/>
-              <w:left w:val="single" w:color="CCCCCC" w:sz="1"/>
-              <w:bottom w:val="single" w:color="CCCCCC" w:sz="1"/>
-              <w:right w:val="single" w:color="CCCCCC" w:sz="1"/>
-            </w:tcBorders>
-            <w:shd w:fill="FFFFFF" w:val="clear"/>
-            <w:tcMar>
-              <w:top w:type="dxa" w:w="80"/>
-              <w:left w:type="dxa" w:w="150"/>
-              <w:bottom w:type="dxa" w:w="80"/>
-              <w:right w:type="dxa" w:w="150"/>
-            </w:tcMar>
-            <w:vAlign w:val="center"/>
-          </w:tcPr>
-          <w:p>
-            <w:pPr>
-              <w:jc w:val="left"/>
-            </w:pPr>
-            <w:r>
-              <w:rPr>
-                <w:rFonts w:ascii="Arial" w:cs="Arial" w:eastAsia="Arial" w:hAnsi="Arial"/>
-                <w:b/>
-                <w:bCs/>
-                <w:color w:val="1F4E79"/>
-                <w:sz w:val="20"/>
-                <w:szCs w:val="20"/>
-              </w:rPr>
-              <w:t xml:space="preserve">Port 443 open on VPS firewall</w:t>
-            </w:r>
-          </w:p>
-        </w:tc>
-        <w:tc>
-          <w:tcPr>
-            <w:tcW w:type="dxa" w:w="6452"/>
-            <w:tcBorders>
-              <w:top w:val="single" w:color="CCCCCC" w:sz="1"/>
-              <w:left w:val="single" w:color="CCCCCC" w:sz="1"/>
-              <w:bottom w:val="single" w:color="CCCCCC" w:sz="1"/>
-              <w:right w:val="single" w:color="CCCCCC" w:sz="1"/>
-            </w:tcBorders>
-            <w:shd w:fill="FFFFFF" w:val="clear"/>
-            <w:tcMar>
-              <w:top w:type="dxa" w:w="80"/>
-              <w:left w:type="dxa" w:w="150"/>
-              <w:bottom w:type="dxa" w:w="80"/>
-              <w:right w:type="dxa" w:w="150"/>
-            </w:tcMar>
-            <w:vAlign w:val="center"/>
-          </w:tcPr>
-          <w:p>
-            <w:pPr>
-              <w:jc w:val="left"/>
-            </w:pPr>
-            <w:r>
-              <w:rPr>
-                <w:rFonts w:ascii="Arial" w:cs="Arial" w:eastAsia="Arial" w:hAnsi="Arial"/>
-                <w:b w:val="false"/>
-                <w:bCs w:val="false"/>
-                <w:color w:val="000000"/>
-                <w:sz w:val="20"/>
-                <w:szCs w:val="20"/>
-              </w:rPr>
-              <w:t xml:space="preserve">ufw allow 443. Meta Webhook only accepts HTTPS on standard port 443.</w:t>
-            </w:r>
-          </w:p>
-        </w:tc>
-      </w:tr>
-      <w:tr>
-        <w:tc>
-          <w:tcPr>
-            <w:tcW w:type="dxa" w:w="520"/>
-            <w:tcBorders>
-              <w:top w:val="single" w:color="2E75B6" w:sz="1"/>
-              <w:left w:val="single" w:color="2E75B6" w:sz="1"/>
-              <w:bottom w:val="single" w:color="2E75B6" w:sz="1"/>
-              <w:right w:val="single" w:color="2E75B6" w:sz="1"/>
-            </w:tcBorders>
-            <w:shd w:fill="2E75B6" w:val="clear"/>
-            <w:tcMar>
-              <w:top w:type="dxa" w:w="80"/>
-              <w:left w:type="dxa" w:w="80"/>
-              <w:bottom w:type="dxa" w:w="80"/>
-              <w:right w:type="dxa" w:w="80"/>
-            </w:tcMar>
-            <w:vAlign w:val="center"/>
-          </w:tcPr>
-          <w:p>
-            <w:pPr>
-              <w:jc w:val="center"/>
-            </w:pPr>
-            <w:r>
-              <w:rPr>
-                <w:rFonts w:ascii="Arial" w:cs="Arial" w:eastAsia="Arial" w:hAnsi="Arial"/>
-                <w:b/>
-                <w:bCs/>
-                <w:color w:val="FFFFFF"/>
-                <w:sz w:val="22"/>
-                <w:szCs w:val="22"/>
-              </w:rPr>
-              <w:t xml:space="preserve">P-07</w:t>
+              <w:t>P-04</w:t>
             </w:r>
           </w:p>
         </w:tc>
@@ -22169,7 +21260,7 @@
               <w:bottom w:val="single" w:color="CCCCCC" w:sz="1"/>
               <w:right w:val="single" w:color="CCCCCC" w:sz="1"/>
             </w:tcBorders>
-            <w:shd w:fill="F5F9FF" w:val="clear"/>
+            <w:shd w:fill="FFFFFF" w:val="clear"/>
             <w:tcMar>
               <w:top w:type="dxa" w:w="80"/>
               <w:left w:type="dxa" w:w="150"/>
@@ -22183,15 +21274,7 @@
               <w:jc w:val="center"/>
             </w:pPr>
             <w:r>
-              <w:rPr>
-                <w:rFonts w:ascii="Arial" w:cs="Arial" w:eastAsia="Arial" w:hAnsi="Arial"/>
-                <w:b w:val="false"/>
-                <w:bCs w:val="false"/>
-                <w:color w:val="000000"/>
-                <w:sz w:val="20"/>
-                <w:szCs w:val="20"/>
-              </w:rPr>
-              <w:t xml:space="preserve">R1</w:t>
+              <w:t>R1</w:t>
             </w:r>
           </w:p>
         </w:tc>
@@ -22204,29 +21287,29 @@
               <w:bottom w:val="single" w:color="CCCCCC" w:sz="1"/>
               <w:right w:val="single" w:color="CCCCCC" w:sz="1"/>
             </w:tcBorders>
-            <w:shd w:fill="F5F9FF" w:val="clear"/>
-            <w:tcMar>
-              <w:top w:type="dxa" w:w="80"/>
-              <w:left w:type="dxa" w:w="150"/>
-              <w:bottom w:type="dxa" w:w="80"/>
-              <w:right w:type="dxa" w:w="150"/>
-            </w:tcMar>
-            <w:vAlign w:val="center"/>
-          </w:tcPr>
-          <w:p>
-            <w:pPr>
-              <w:jc w:val="left"/>
-            </w:pPr>
-            <w:r>
-              <w:rPr>
-                <w:rFonts w:ascii="Arial" w:cs="Arial" w:eastAsia="Arial" w:hAnsi="Arial"/>
-                <w:b w:val="false"/>
-                <w:bCs w:val="false"/>
-                <w:color w:val="000000"/>
-                <w:sz w:val="20"/>
-                <w:szCs w:val="20"/>
-              </w:rPr>
-              <w:t xml:space="preserve">Home router behind CG-NAT (no real public IP)</w:t>
+            <w:shd w:fill="FFFFFF" w:val="clear"/>
+            <w:tcMar>
+              <w:top w:type="dxa" w:w="80"/>
+              <w:left w:type="dxa" w:w="150"/>
+              <w:bottom w:type="dxa" w:w="80"/>
+              <w:right w:type="dxa" w:w="150"/>
+            </w:tcMar>
+            <w:vAlign w:val="center"/>
+          </w:tcPr>
+          <w:p>
+            <w:pPr>
+              <w:jc w:val="left"/>
+            </w:pPr>
+            <w:r>
+              <w:rPr>
+                <w:rFonts w:ascii="Arial" w:cs="Arial" w:eastAsia="Arial" w:hAnsi="Arial"/>
+                <w:b w:val="false"/>
+                <w:bCs w:val="false"/>
+                <w:color w:val="000000"/>
+                <w:sz w:val="20"/>
+                <w:szCs w:val="20"/>
+              </w:rPr>
+              <w:t xml:space="preserve">Wall switch NOT wired to Digital Input</w:t>
             </w:r>
           </w:p>
         </w:tc>
@@ -22239,7 +21322,7 @@
               <w:bottom w:val="single" w:color="CCCCCC" w:sz="1"/>
               <w:right w:val="single" w:color="CCCCCC" w:sz="1"/>
             </w:tcBorders>
-            <w:shd w:fill="FFD0D0" w:val="clear"/>
+            <w:shd w:fill="FFE0E0" w:val="clear"/>
             <w:tcMar>
               <w:top w:type="dxa" w:w="80"/>
               <w:left w:type="dxa" w:w="150"/>
@@ -22261,7 +21344,7 @@
                 <w:sz w:val="20"/>
                 <w:szCs w:val="20"/>
               </w:rPr>
-              <w:t xml:space="preserve">CRITICAL</w:t>
+              <w:t xml:space="preserve">HIGH</w:t>
             </w:r>
           </w:p>
         </w:tc>
@@ -22274,29 +21357,29 @@
               <w:bottom w:val="single" w:color="CCCCCC" w:sz="1"/>
               <w:right w:val="single" w:color="CCCCCC" w:sz="1"/>
             </w:tcBorders>
-            <w:shd w:fill="F5F9FF" w:val="clear"/>
-            <w:tcMar>
-              <w:top w:type="dxa" w:w="80"/>
-              <w:left w:type="dxa" w:w="150"/>
-              <w:bottom w:type="dxa" w:w="80"/>
-              <w:right w:type="dxa" w:w="150"/>
-            </w:tcMar>
-            <w:vAlign w:val="center"/>
-          </w:tcPr>
-          <w:p>
-            <w:pPr>
-              <w:jc w:val="left"/>
-            </w:pPr>
-            <w:r>
-              <w:rPr>
-                <w:rFonts w:ascii="Arial" w:cs="Arial" w:eastAsia="Arial" w:hAnsi="Arial"/>
-                <w:b w:val="false"/>
-                <w:bCs w:val="false"/>
-                <w:color w:val="000000"/>
-                <w:sz w:val="20"/>
-                <w:szCs w:val="20"/>
-              </w:rPr>
-              <w:t xml:space="preserve">Port forwarding impossible — entire Option A fails</w:t>
+            <w:shd w:fill="FFFFFF" w:val="clear"/>
+            <w:tcMar>
+              <w:top w:type="dxa" w:w="80"/>
+              <w:left w:type="dxa" w:w="150"/>
+              <w:bottom w:type="dxa" w:w="80"/>
+              <w:right w:type="dxa" w:w="150"/>
+            </w:tcMar>
+            <w:vAlign w:val="center"/>
+          </w:tcPr>
+          <w:p>
+            <w:pPr>
+              <w:jc w:val="left"/>
+            </w:pPr>
+            <w:r>
+              <w:rPr>
+                <w:rFonts w:ascii="Arial" w:cs="Arial" w:eastAsia="Arial" w:hAnsi="Arial"/>
+                <w:b w:val="false"/>
+                <w:bCs w:val="false"/>
+                <w:color w:val="000000"/>
+                <w:sz w:val="20"/>
+                <w:szCs w:val="20"/>
+              </w:rPr>
+              <w:t xml:space="preserve">Physical sync impossible — IPX800 cannot detect switch state</w:t>
             </w:r>
           </w:p>
         </w:tc>
@@ -22309,29 +21392,29 @@
               <w:bottom w:val="single" w:color="CCCCCC" w:sz="1"/>
               <w:right w:val="single" w:color="CCCCCC" w:sz="1"/>
             </w:tcBorders>
-            <w:shd w:fill="F5F9FF" w:val="clear"/>
-            <w:tcMar>
-              <w:top w:type="dxa" w:w="80"/>
-              <w:left w:type="dxa" w:w="150"/>
-              <w:bottom w:type="dxa" w:w="80"/>
-              <w:right w:type="dxa" w:w="150"/>
-            </w:tcMar>
-            <w:vAlign w:val="center"/>
-          </w:tcPr>
-          <w:p>
-            <w:pPr>
-              <w:jc w:val="left"/>
-            </w:pPr>
-            <w:r>
-              <w:rPr>
-                <w:rFonts w:ascii="Arial" w:cs="Arial" w:eastAsia="Arial" w:hAnsi="Arial"/>
-                <w:b w:val="false"/>
-                <w:bCs w:val="false"/>
-                <w:color w:val="000000"/>
-                <w:sz w:val="20"/>
-                <w:szCs w:val="20"/>
-              </w:rPr>
-              <w:t xml:space="preserve">Run curl ifconfig.me vs router WAN IP before any work. If CG-NAT confirmed, switch to frp reverse tunnel.</w:t>
+            <w:shd w:fill="FFFFFF" w:val="clear"/>
+            <w:tcMar>
+              <w:top w:type="dxa" w:w="80"/>
+              <w:left w:type="dxa" w:w="150"/>
+              <w:bottom w:type="dxa" w:w="80"/>
+              <w:right w:type="dxa" w:w="150"/>
+            </w:tcMar>
+            <w:vAlign w:val="center"/>
+          </w:tcPr>
+          <w:p>
+            <w:pPr>
+              <w:jc w:val="left"/>
+            </w:pPr>
+            <w:r>
+              <w:rPr>
+                <w:rFonts w:ascii="Arial" w:cs="Arial" w:eastAsia="Arial" w:hAnsi="Arial"/>
+                <w:b w:val="false"/>
+                <w:bCs w:val="false"/>
+                <w:color w:val="000000"/>
+                <w:sz w:val="20"/>
+                <w:szCs w:val="20"/>
+              </w:rPr>
+              <w:t xml:space="preserve">Confirm wiring before building sync module. Fallback: polling every 60s</w:t>
             </w:r>
           </w:p>
         </w:tc>
@@ -22346,7 +21429,7 @@
               <w:bottom w:val="single" w:color="CCCCCC" w:sz="1"/>
               <w:right w:val="single" w:color="CCCCCC" w:sz="1"/>
             </w:tcBorders>
-            <w:shd w:fill="FFFFFF" w:val="clear"/>
+            <w:shd w:fill="F5F9FF" w:val="clear"/>
             <w:tcMar>
               <w:top w:type="dxa" w:w="80"/>
               <w:left w:type="dxa" w:w="150"/>
@@ -22360,15 +21443,7 @@
               <w:jc w:val="center"/>
             </w:pPr>
             <w:r>
-              <w:rPr>
-                <w:rFonts w:ascii="Arial" w:cs="Arial" w:eastAsia="Arial" w:hAnsi="Arial"/>
-                <w:b w:val="false"/>
-                <w:bCs w:val="false"/>
-                <w:color w:val="000000"/>
-                <w:sz w:val="20"/>
-                <w:szCs w:val="20"/>
-              </w:rPr>
-              <w:t xml:space="preserve">R2</w:t>
+              <w:t>R2</w:t>
             </w:r>
           </w:p>
         </w:tc>
@@ -22381,29 +21456,29 @@
               <w:bottom w:val="single" w:color="CCCCCC" w:sz="1"/>
               <w:right w:val="single" w:color="CCCCCC" w:sz="1"/>
             </w:tcBorders>
-            <w:shd w:fill="FFFFFF" w:val="clear"/>
-            <w:tcMar>
-              <w:top w:type="dxa" w:w="80"/>
-              <w:left w:type="dxa" w:w="150"/>
-              <w:bottom w:type="dxa" w:w="80"/>
-              <w:right w:type="dxa" w:w="150"/>
-            </w:tcMar>
-            <w:vAlign w:val="center"/>
-          </w:tcPr>
-          <w:p>
-            <w:pPr>
-              <w:jc w:val="left"/>
-            </w:pPr>
-            <w:r>
-              <w:rPr>
-                <w:rFonts w:ascii="Arial" w:cs="Arial" w:eastAsia="Arial" w:hAnsi="Arial"/>
-                <w:b w:val="false"/>
-                <w:bCs w:val="false"/>
-                <w:color w:val="000000"/>
-                <w:sz w:val="20"/>
-                <w:szCs w:val="20"/>
-              </w:rPr>
-              <w:t xml:space="preserve">DDNS update lag after home IP change</w:t>
+            <w:shd w:fill="F5F9FF" w:val="clear"/>
+            <w:tcMar>
+              <w:top w:type="dxa" w:w="80"/>
+              <w:left w:type="dxa" w:w="150"/>
+              <w:bottom w:type="dxa" w:w="80"/>
+              <w:right w:type="dxa" w:w="150"/>
+            </w:tcMar>
+            <w:vAlign w:val="center"/>
+          </w:tcPr>
+          <w:p>
+            <w:pPr>
+              <w:jc w:val="left"/>
+            </w:pPr>
+            <w:r>
+              <w:rPr>
+                <w:rFonts w:ascii="Arial" w:cs="Arial" w:eastAsia="Arial" w:hAnsi="Arial"/>
+                <w:b w:val="false"/>
+                <w:bCs w:val="false"/>
+                <w:color w:val="000000"/>
+                <w:sz w:val="20"/>
+                <w:szCs w:val="20"/>
+              </w:rPr>
+              <w:t xml:space="preserve">Curtain interlock failure — motor damaged</w:t>
             </w:r>
           </w:p>
         </w:tc>
@@ -22451,29 +21526,29 @@
               <w:bottom w:val="single" w:color="CCCCCC" w:sz="1"/>
               <w:right w:val="single" w:color="CCCCCC" w:sz="1"/>
             </w:tcBorders>
-            <w:shd w:fill="FFFFFF" w:val="clear"/>
-            <w:tcMar>
-              <w:top w:type="dxa" w:w="80"/>
-              <w:left w:type="dxa" w:w="150"/>
-              <w:bottom w:type="dxa" w:w="80"/>
-              <w:right w:type="dxa" w:w="150"/>
-            </w:tcMar>
-            <w:vAlign w:val="center"/>
-          </w:tcPr>
-          <w:p>
-            <w:pPr>
-              <w:jc w:val="left"/>
-            </w:pPr>
-            <w:r>
-              <w:rPr>
-                <w:rFonts w:ascii="Arial" w:cs="Arial" w:eastAsia="Arial" w:hAnsi="Arial"/>
-                <w:b w:val="false"/>
-                <w:bCs w:val="false"/>
-                <w:color w:val="000000"/>
-                <w:sz w:val="20"/>
-                <w:szCs w:val="20"/>
-              </w:rPr>
-              <w:t xml:space="preserve">Commands fail for up to 5 minutes after ISP reassigns IP</w:t>
+            <w:shd w:fill="F5F9FF" w:val="clear"/>
+            <w:tcMar>
+              <w:top w:type="dxa" w:w="80"/>
+              <w:left w:type="dxa" w:w="150"/>
+              <w:bottom w:type="dxa" w:w="80"/>
+              <w:right w:type="dxa" w:w="150"/>
+            </w:tcMar>
+            <w:vAlign w:val="center"/>
+          </w:tcPr>
+          <w:p>
+            <w:pPr>
+              <w:jc w:val="left"/>
+            </w:pPr>
+            <w:r>
+              <w:rPr>
+                <w:rFonts w:ascii="Arial" w:cs="Arial" w:eastAsia="Arial" w:hAnsi="Arial"/>
+                <w:b w:val="false"/>
+                <w:bCs w:val="false"/>
+                <w:color w:val="000000"/>
+                <w:sz w:val="20"/>
+                <w:szCs w:val="20"/>
+              </w:rPr>
+              <w:t xml:space="preserve">Physical hardware damage</w:t>
             </w:r>
           </w:p>
         </w:tc>
@@ -22486,29 +21561,29 @@
               <w:bottom w:val="single" w:color="CCCCCC" w:sz="1"/>
               <w:right w:val="single" w:color="CCCCCC" w:sz="1"/>
             </w:tcBorders>
-            <w:shd w:fill="FFFFFF" w:val="clear"/>
-            <w:tcMar>
-              <w:top w:type="dxa" w:w="80"/>
-              <w:left w:type="dxa" w:w="150"/>
-              <w:bottom w:type="dxa" w:w="80"/>
-              <w:right w:type="dxa" w:w="150"/>
-            </w:tcMar>
-            <w:vAlign w:val="center"/>
-          </w:tcPr>
-          <w:p>
-            <w:pPr>
-              <w:jc w:val="left"/>
-            </w:pPr>
-            <w:r>
-              <w:rPr>
-                <w:rFonts w:ascii="Arial" w:cs="Arial" w:eastAsia="Arial" w:hAnsi="Arial"/>
-                <w:b w:val="false"/>
-                <w:bCs w:val="false"/>
-                <w:color w:val="000000"/>
-                <w:sz w:val="20"/>
-                <w:szCs w:val="20"/>
-              </w:rPr>
-              <w:t xml:space="preserve">httpx retry 3x with 10s delay covers most lag. Alert user if all retries fail. DuckDNS TTL is 60s.</w:t>
+            <w:shd w:fill="F5F9FF" w:val="clear"/>
+            <w:tcMar>
+              <w:top w:type="dxa" w:w="80"/>
+              <w:left w:type="dxa" w:w="150"/>
+              <w:bottom w:type="dxa" w:w="80"/>
+              <w:right w:type="dxa" w:w="150"/>
+            </w:tcMar>
+            <w:vAlign w:val="center"/>
+          </w:tcPr>
+          <w:p>
+            <w:pPr>
+              <w:jc w:val="left"/>
+            </w:pPr>
+            <w:r>
+              <w:rPr>
+                <w:rFonts w:ascii="Arial" w:cs="Arial" w:eastAsia="Arial" w:hAnsi="Arial"/>
+                <w:b w:val="false"/>
+                <w:bCs w:val="false"/>
+                <w:color w:val="000000"/>
+                <w:sz w:val="20"/>
+                <w:szCs w:val="20"/>
+              </w:rPr>
+              <w:t xml:space="preserve">Code-level AND hardware-level interlock. Test with unpowered motor first</w:t>
             </w:r>
           </w:p>
         </w:tc>
@@ -22523,7 +21598,7 @@
               <w:bottom w:val="single" w:color="CCCCCC" w:sz="1"/>
               <w:right w:val="single" w:color="CCCCCC" w:sz="1"/>
             </w:tcBorders>
-            <w:shd w:fill="F5F9FF" w:val="clear"/>
+            <w:shd w:fill="FFFFFF" w:val="clear"/>
             <w:tcMar>
               <w:top w:type="dxa" w:w="80"/>
               <w:left w:type="dxa" w:w="150"/>
@@ -22537,15 +21612,7 @@
               <w:jc w:val="center"/>
             </w:pPr>
             <w:r>
-              <w:rPr>
-                <w:rFonts w:ascii="Arial" w:cs="Arial" w:eastAsia="Arial" w:hAnsi="Arial"/>
-                <w:b w:val="false"/>
-                <w:bCs w:val="false"/>
-                <w:color w:val="000000"/>
-                <w:sz w:val="20"/>
-                <w:szCs w:val="20"/>
-              </w:rPr>
-              <w:t xml:space="preserve">R3</w:t>
+              <w:t>R3</w:t>
             </w:r>
           </w:p>
         </w:tc>
@@ -22558,29 +21625,29 @@
               <w:bottom w:val="single" w:color="CCCCCC" w:sz="1"/>
               <w:right w:val="single" w:color="CCCCCC" w:sz="1"/>
             </w:tcBorders>
-            <w:shd w:fill="F5F9FF" w:val="clear"/>
-            <w:tcMar>
-              <w:top w:type="dxa" w:w="80"/>
-              <w:left w:type="dxa" w:w="150"/>
-              <w:bottom w:type="dxa" w:w="80"/>
-              <w:right w:type="dxa" w:w="150"/>
-            </w:tcMar>
-            <w:vAlign w:val="center"/>
-          </w:tcPr>
-          <w:p>
-            <w:pPr>
-              <w:jc w:val="left"/>
-            </w:pPr>
-            <w:r>
-              <w:rPr>
-                <w:rFonts w:ascii="Arial" w:cs="Arial" w:eastAsia="Arial" w:hAnsi="Arial"/>
-                <w:b w:val="false"/>
-                <w:bCs w:val="false"/>
-                <w:color w:val="000000"/>
-                <w:sz w:val="20"/>
-                <w:szCs w:val="20"/>
-              </w:rPr>
-              <w:t xml:space="preserve">ISP blocks inbound port 8080</w:t>
+            <w:shd w:fill="FFFFFF" w:val="clear"/>
+            <w:tcMar>
+              <w:top w:type="dxa" w:w="80"/>
+              <w:left w:type="dxa" w:w="150"/>
+              <w:bottom w:type="dxa" w:w="80"/>
+              <w:right w:type="dxa" w:w="150"/>
+            </w:tcMar>
+            <w:vAlign w:val="center"/>
+          </w:tcPr>
+          <w:p>
+            <w:pPr>
+              <w:jc w:val="left"/>
+            </w:pPr>
+            <w:r>
+              <w:rPr>
+                <w:rFonts w:ascii="Arial" w:cs="Arial" w:eastAsia="Arial" w:hAnsi="Arial"/>
+                <w:b w:val="false"/>
+                <w:bCs w:val="false"/>
+                <w:color w:val="000000"/>
+                <w:sz w:val="20"/>
+                <w:szCs w:val="20"/>
+              </w:rPr>
+              <w:t xml:space="preserve">Meta Access Token expires</w:t>
             </w:r>
           </w:p>
         </w:tc>
@@ -22628,29 +21695,29 @@
               <w:bottom w:val="single" w:color="CCCCCC" w:sz="1"/>
               <w:right w:val="single" w:color="CCCCCC" w:sz="1"/>
             </w:tcBorders>
-            <w:shd w:fill="F5F9FF" w:val="clear"/>
-            <w:tcMar>
-              <w:top w:type="dxa" w:w="80"/>
-              <w:left w:type="dxa" w:w="150"/>
-              <w:bottom w:type="dxa" w:w="80"/>
-              <w:right w:type="dxa" w:w="150"/>
-            </w:tcMar>
-            <w:vAlign w:val="center"/>
-          </w:tcPr>
-          <w:p>
-            <w:pPr>
-              <w:jc w:val="left"/>
-            </w:pPr>
-            <w:r>
-              <w:rPr>
-                <w:rFonts w:ascii="Arial" w:cs="Arial" w:eastAsia="Arial" w:hAnsi="Arial"/>
-                <w:b w:val="false"/>
-                <w:bCs w:val="false"/>
-                <w:color w:val="000000"/>
-                <w:sz w:val="20"/>
-                <w:szCs w:val="20"/>
-              </w:rPr>
-              <w:t xml:space="preserve">Port forwarding rule exists but external connections are dropped</w:t>
+            <w:shd w:fill="FFFFFF" w:val="clear"/>
+            <w:tcMar>
+              <w:top w:type="dxa" w:w="80"/>
+              <w:left w:type="dxa" w:w="150"/>
+              <w:bottom w:type="dxa" w:w="80"/>
+              <w:right w:type="dxa" w:w="150"/>
+            </w:tcMar>
+            <w:vAlign w:val="center"/>
+          </w:tcPr>
+          <w:p>
+            <w:pPr>
+              <w:jc w:val="left"/>
+            </w:pPr>
+            <w:r>
+              <w:rPr>
+                <w:rFonts w:ascii="Arial" w:cs="Arial" w:eastAsia="Arial" w:hAnsi="Arial"/>
+                <w:b w:val="false"/>
+                <w:bCs w:val="false"/>
+                <w:color w:val="000000"/>
+                <w:sz w:val="20"/>
+                <w:szCs w:val="20"/>
+              </w:rPr>
+              <w:t xml:space="preserve">WhatsApp replies stop silently</w:t>
             </w:r>
           </w:p>
         </w:tc>
@@ -22663,29 +21730,29 @@
               <w:bottom w:val="single" w:color="CCCCCC" w:sz="1"/>
               <w:right w:val="single" w:color="CCCCCC" w:sz="1"/>
             </w:tcBorders>
-            <w:shd w:fill="F5F9FF" w:val="clear"/>
-            <w:tcMar>
-              <w:top w:type="dxa" w:w="80"/>
-              <w:left w:type="dxa" w:w="150"/>
-              <w:bottom w:type="dxa" w:w="80"/>
-              <w:right w:type="dxa" w:w="150"/>
-            </w:tcMar>
-            <w:vAlign w:val="center"/>
-          </w:tcPr>
-          <w:p>
-            <w:pPr>
-              <w:jc w:val="left"/>
-            </w:pPr>
-            <w:r>
-              <w:rPr>
-                <w:rFonts w:ascii="Arial" w:cs="Arial" w:eastAsia="Arial" w:hAnsi="Arial"/>
-                <w:b w:val="false"/>
-                <w:bCs w:val="false"/>
-                <w:color w:val="000000"/>
-                <w:sz w:val="20"/>
-                <w:szCs w:val="20"/>
-              </w:rPr>
-              <w:t xml:space="preserve">Test from VPS: nc -zv myhome.duckdns.org 8080. If blocked, try port 8443 or 9000.</w:t>
+            <w:shd w:fill="FFFFFF" w:val="clear"/>
+            <w:tcMar>
+              <w:top w:type="dxa" w:w="80"/>
+              <w:left w:type="dxa" w:w="150"/>
+              <w:bottom w:type="dxa" w:w="80"/>
+              <w:right w:type="dxa" w:w="150"/>
+            </w:tcMar>
+            <w:vAlign w:val="center"/>
+          </w:tcPr>
+          <w:p>
+            <w:pPr>
+              <w:jc w:val="left"/>
+            </w:pPr>
+            <w:r>
+              <w:rPr>
+                <w:rFonts w:ascii="Arial" w:cs="Arial" w:eastAsia="Arial" w:hAnsi="Arial"/>
+                <w:b w:val="false"/>
+                <w:bCs w:val="false"/>
+                <w:color w:val="000000"/>
+                <w:sz w:val="20"/>
+                <w:szCs w:val="20"/>
+              </w:rPr>
+              <w:t xml:space="preserve">Use System User Token (never expires). Add 401 error monitoring</w:t>
             </w:r>
           </w:p>
         </w:tc>
@@ -22700,7 +21767,7 @@
               <w:bottom w:val="single" w:color="CCCCCC" w:sz="1"/>
               <w:right w:val="single" w:color="CCCCCC" w:sz="1"/>
             </w:tcBorders>
-            <w:shd w:fill="FFFFFF" w:val="clear"/>
+            <w:shd w:fill="F5F9FF" w:val="clear"/>
             <w:tcMar>
               <w:top w:type="dxa" w:w="80"/>
               <w:left w:type="dxa" w:w="150"/>
@@ -22714,15 +21781,7 @@
               <w:jc w:val="center"/>
             </w:pPr>
             <w:r>
-              <w:rPr>
-                <w:rFonts w:ascii="Arial" w:cs="Arial" w:eastAsia="Arial" w:hAnsi="Arial"/>
-                <w:b w:val="false"/>
-                <w:bCs w:val="false"/>
-                <w:color w:val="000000"/>
-                <w:sz w:val="20"/>
-                <w:szCs w:val="20"/>
-              </w:rPr>
-              <w:t xml:space="preserve">R4</w:t>
+              <w:t>R4</w:t>
             </w:r>
           </w:p>
         </w:tc>
@@ -22735,29 +21794,29 @@
               <w:bottom w:val="single" w:color="CCCCCC" w:sz="1"/>
               <w:right w:val="single" w:color="CCCCCC" w:sz="1"/>
             </w:tcBorders>
-            <w:shd w:fill="FFFFFF" w:val="clear"/>
-            <w:tcMar>
-              <w:top w:type="dxa" w:w="80"/>
-              <w:left w:type="dxa" w:w="150"/>
-              <w:bottom w:type="dxa" w:w="80"/>
-              <w:right w:type="dxa" w:w="150"/>
-            </w:tcMar>
-            <w:vAlign w:val="center"/>
-          </w:tcPr>
-          <w:p>
-            <w:pPr>
-              <w:jc w:val="left"/>
-            </w:pPr>
-            <w:r>
-              <w:rPr>
-                <w:rFonts w:ascii="Arial" w:cs="Arial" w:eastAsia="Arial" w:hAnsi="Arial"/>
-                <w:b w:val="false"/>
-                <w:bCs w:val="false"/>
-                <w:color w:val="000000"/>
-                <w:sz w:val="20"/>
-                <w:szCs w:val="20"/>
-              </w:rPr>
-              <w:t xml:space="preserve">Wall switch NOT wired to Digital Input</w:t>
+            <w:shd w:fill="F5F9FF" w:val="clear"/>
+            <w:tcMar>
+              <w:top w:type="dxa" w:w="80"/>
+              <w:left w:type="dxa" w:w="150"/>
+              <w:bottom w:type="dxa" w:w="80"/>
+              <w:right w:type="dxa" w:w="150"/>
+            </w:tcMar>
+            <w:vAlign w:val="center"/>
+          </w:tcPr>
+          <w:p>
+            <w:pPr>
+              <w:jc w:val="left"/>
+            </w:pPr>
+            <w:r>
+              <w:rPr>
+                <w:rFonts w:ascii="Arial" w:cs="Arial" w:eastAsia="Arial" w:hAnsi="Arial"/>
+                <w:b w:val="false"/>
+                <w:bCs w:val="false"/>
+                <w:color w:val="000000"/>
+                <w:sz w:val="20"/>
+                <w:szCs w:val="20"/>
+              </w:rPr>
+              <w:t xml:space="preserve">IPX800 0-based vs 1-based index confusion</w:t>
             </w:r>
           </w:p>
         </w:tc>
@@ -22805,29 +21864,29 @@
               <w:bottom w:val="single" w:color="CCCCCC" w:sz="1"/>
               <w:right w:val="single" w:color="CCCCCC" w:sz="1"/>
             </w:tcBorders>
-            <w:shd w:fill="FFFFFF" w:val="clear"/>
-            <w:tcMar>
-              <w:top w:type="dxa" w:w="80"/>
-              <w:left w:type="dxa" w:w="150"/>
-              <w:bottom w:type="dxa" w:w="80"/>
-              <w:right w:type="dxa" w:w="150"/>
-            </w:tcMar>
-            <w:vAlign w:val="center"/>
-          </w:tcPr>
-          <w:p>
-            <w:pPr>
-              <w:jc w:val="left"/>
-            </w:pPr>
-            <w:r>
-              <w:rPr>
-                <w:rFonts w:ascii="Arial" w:cs="Arial" w:eastAsia="Arial" w:hAnsi="Arial"/>
-                <w:b w:val="false"/>
-                <w:bCs w:val="false"/>
-                <w:color w:val="000000"/>
-                <w:sz w:val="20"/>
-                <w:szCs w:val="20"/>
-              </w:rPr>
-              <w:t xml:space="preserve">Physical sync impossible — IPX800 cannot detect switch state</w:t>
+            <w:shd w:fill="F5F9FF" w:val="clear"/>
+            <w:tcMar>
+              <w:top w:type="dxa" w:w="80"/>
+              <w:left w:type="dxa" w:w="150"/>
+              <w:bottom w:type="dxa" w:w="80"/>
+              <w:right w:type="dxa" w:w="150"/>
+            </w:tcMar>
+            <w:vAlign w:val="center"/>
+          </w:tcPr>
+          <w:p>
+            <w:pPr>
+              <w:jc w:val="left"/>
+            </w:pPr>
+            <w:r>
+              <w:rPr>
+                <w:rFonts w:ascii="Arial" w:cs="Arial" w:eastAsia="Arial" w:hAnsi="Arial"/>
+                <w:b w:val="false"/>
+                <w:bCs w:val="false"/>
+                <w:color w:val="000000"/>
+                <w:sz w:val="20"/>
+                <w:szCs w:val="20"/>
+              </w:rPr>
+              <w:t xml:space="preserve">Wrong relay activated — dangerous if curtain relays swapped</w:t>
             </w:r>
           </w:p>
         </w:tc>
@@ -22840,29 +21899,29 @@
               <w:bottom w:val="single" w:color="CCCCCC" w:sz="1"/>
               <w:right w:val="single" w:color="CCCCCC" w:sz="1"/>
             </w:tcBorders>
-            <w:shd w:fill="FFFFFF" w:val="clear"/>
-            <w:tcMar>
-              <w:top w:type="dxa" w:w="80"/>
-              <w:left w:type="dxa" w:w="150"/>
-              <w:bottom w:type="dxa" w:w="80"/>
-              <w:right w:type="dxa" w:w="150"/>
-            </w:tcMar>
-            <w:vAlign w:val="center"/>
-          </w:tcPr>
-          <w:p>
-            <w:pPr>
-              <w:jc w:val="left"/>
-            </w:pPr>
-            <w:r>
-              <w:rPr>
-                <w:rFonts w:ascii="Arial" w:cs="Arial" w:eastAsia="Arial" w:hAnsi="Arial"/>
-                <w:b w:val="false"/>
-                <w:bCs w:val="false"/>
-                <w:color w:val="000000"/>
-                <w:sz w:val="20"/>
-                <w:szCs w:val="20"/>
-              </w:rPr>
-              <w:t xml:space="preserve">Confirm wiring before building sync module. Fallback: polling every 60s</w:t>
+            <w:shd w:fill="F5F9FF" w:val="clear"/>
+            <w:tcMar>
+              <w:top w:type="dxa" w:w="80"/>
+              <w:left w:type="dxa" w:w="150"/>
+              <w:bottom w:type="dxa" w:w="80"/>
+              <w:right w:type="dxa" w:w="150"/>
+            </w:tcMar>
+            <w:vAlign w:val="center"/>
+          </w:tcPr>
+          <w:p>
+            <w:pPr>
+              <w:jc w:val="left"/>
+            </w:pPr>
+            <w:r>
+              <w:rPr>
+                <w:rFonts w:ascii="Arial" w:cs="Arial" w:eastAsia="Arial" w:hAnsi="Arial"/>
+                <w:b w:val="false"/>
+                <w:bCs w:val="false"/>
+                <w:color w:val="000000"/>
+                <w:sz w:val="20"/>
+                <w:szCs w:val="20"/>
+              </w:rPr>
+              <w:t xml:space="preserve">Unit test relay mapping with physical verification before any live testing</w:t>
             </w:r>
           </w:p>
         </w:tc>
@@ -22877,7 +21936,7 @@
               <w:bottom w:val="single" w:color="CCCCCC" w:sz="1"/>
               <w:right w:val="single" w:color="CCCCCC" w:sz="1"/>
             </w:tcBorders>
-            <w:shd w:fill="F5F9FF" w:val="clear"/>
+            <w:shd w:fill="FFFFFF" w:val="clear"/>
             <w:tcMar>
               <w:top w:type="dxa" w:w="80"/>
               <w:left w:type="dxa" w:w="150"/>
@@ -22891,546 +21950,7 @@
               <w:jc w:val="center"/>
             </w:pPr>
             <w:r>
-              <w:rPr>
-                <w:rFonts w:ascii="Arial" w:cs="Arial" w:eastAsia="Arial" w:hAnsi="Arial"/>
-                <w:b w:val="false"/>
-                <w:bCs w:val="false"/>
-                <w:color w:val="000000"/>
-                <w:sz w:val="20"/>
-                <w:szCs w:val="20"/>
-              </w:rPr>
-              <w:t xml:space="preserve">R5</w:t>
-            </w:r>
-          </w:p>
-        </w:tc>
-        <w:tc>
-          <w:tcPr>
-            <w:tcW w:type="dxa" w:w="2200"/>
-            <w:tcBorders>
-              <w:top w:val="single" w:color="CCCCCC" w:sz="1"/>
-              <w:left w:val="single" w:color="CCCCCC" w:sz="1"/>
-              <w:bottom w:val="single" w:color="CCCCCC" w:sz="1"/>
-              <w:right w:val="single" w:color="CCCCCC" w:sz="1"/>
-            </w:tcBorders>
-            <w:shd w:fill="F5F9FF" w:val="clear"/>
-            <w:tcMar>
-              <w:top w:type="dxa" w:w="80"/>
-              <w:left w:type="dxa" w:w="150"/>
-              <w:bottom w:type="dxa" w:w="80"/>
-              <w:right w:type="dxa" w:w="150"/>
-            </w:tcMar>
-            <w:vAlign w:val="center"/>
-          </w:tcPr>
-          <w:p>
-            <w:pPr>
-              <w:jc w:val="left"/>
-            </w:pPr>
-            <w:r>
-              <w:rPr>
-                <w:rFonts w:ascii="Arial" w:cs="Arial" w:eastAsia="Arial" w:hAnsi="Arial"/>
-                <w:b w:val="false"/>
-                <w:bCs w:val="false"/>
-                <w:color w:val="000000"/>
-                <w:sz w:val="20"/>
-                <w:szCs w:val="20"/>
-              </w:rPr>
-              <w:t xml:space="preserve">Curtain interlock failure — motor damaged</w:t>
-            </w:r>
-          </w:p>
-        </w:tc>
-        <w:tc>
-          <w:tcPr>
-            <w:tcW w:type="dxa" w:w="1000"/>
-            <w:tcBorders>
-              <w:top w:val="single" w:color="CCCCCC" w:sz="1"/>
-              <w:left w:val="single" w:color="CCCCCC" w:sz="1"/>
-              <w:bottom w:val="single" w:color="CCCCCC" w:sz="1"/>
-              <w:right w:val="single" w:color="CCCCCC" w:sz="1"/>
-            </w:tcBorders>
-            <w:shd w:fill="FFE0E0" w:val="clear"/>
-            <w:tcMar>
-              <w:top w:type="dxa" w:w="80"/>
-              <w:left w:type="dxa" w:w="150"/>
-              <w:bottom w:type="dxa" w:w="80"/>
-              <w:right w:type="dxa" w:w="150"/>
-            </w:tcMar>
-            <w:vAlign w:val="center"/>
-          </w:tcPr>
-          <w:p>
-            <w:pPr>
-              <w:jc w:val="left"/>
-            </w:pPr>
-            <w:r>
-              <w:rPr>
-                <w:rFonts w:ascii="Arial" w:cs="Arial" w:eastAsia="Arial" w:hAnsi="Arial"/>
-                <w:b/>
-                <w:bCs/>
-                <w:color w:val="C00000"/>
-                <w:sz w:val="20"/>
-                <w:szCs w:val="20"/>
-              </w:rPr>
-              <w:t xml:space="preserve">HIGH</w:t>
-            </w:r>
-          </w:p>
-        </w:tc>
-        <w:tc>
-          <w:tcPr>
-            <w:tcW w:type="dxa" w:w="2600"/>
-            <w:tcBorders>
-              <w:top w:val="single" w:color="CCCCCC" w:sz="1"/>
-              <w:left w:val="single" w:color="CCCCCC" w:sz="1"/>
-              <w:bottom w:val="single" w:color="CCCCCC" w:sz="1"/>
-              <w:right w:val="single" w:color="CCCCCC" w:sz="1"/>
-            </w:tcBorders>
-            <w:shd w:fill="F5F9FF" w:val="clear"/>
-            <w:tcMar>
-              <w:top w:type="dxa" w:w="80"/>
-              <w:left w:type="dxa" w:w="150"/>
-              <w:bottom w:type="dxa" w:w="80"/>
-              <w:right w:type="dxa" w:w="150"/>
-            </w:tcMar>
-            <w:vAlign w:val="center"/>
-          </w:tcPr>
-          <w:p>
-            <w:pPr>
-              <w:jc w:val="left"/>
-            </w:pPr>
-            <w:r>
-              <w:rPr>
-                <w:rFonts w:ascii="Arial" w:cs="Arial" w:eastAsia="Arial" w:hAnsi="Arial"/>
-                <w:b w:val="false"/>
-                <w:bCs w:val="false"/>
-                <w:color w:val="000000"/>
-                <w:sz w:val="20"/>
-                <w:szCs w:val="20"/>
-              </w:rPr>
-              <w:t xml:space="preserve">Physical hardware damage</w:t>
-            </w:r>
-          </w:p>
-        </w:tc>
-        <w:tc>
-          <w:tcPr>
-            <w:tcW w:type="dxa" w:w="3772"/>
-            <w:tcBorders>
-              <w:top w:val="single" w:color="CCCCCC" w:sz="1"/>
-              <w:left w:val="single" w:color="CCCCCC" w:sz="1"/>
-              <w:bottom w:val="single" w:color="CCCCCC" w:sz="1"/>
-              <w:right w:val="single" w:color="CCCCCC" w:sz="1"/>
-            </w:tcBorders>
-            <w:shd w:fill="F5F9FF" w:val="clear"/>
-            <w:tcMar>
-              <w:top w:type="dxa" w:w="80"/>
-              <w:left w:type="dxa" w:w="150"/>
-              <w:bottom w:type="dxa" w:w="80"/>
-              <w:right w:type="dxa" w:w="150"/>
-            </w:tcMar>
-            <w:vAlign w:val="center"/>
-          </w:tcPr>
-          <w:p>
-            <w:pPr>
-              <w:jc w:val="left"/>
-            </w:pPr>
-            <w:r>
-              <w:rPr>
-                <w:rFonts w:ascii="Arial" w:cs="Arial" w:eastAsia="Arial" w:hAnsi="Arial"/>
-                <w:b w:val="false"/>
-                <w:bCs w:val="false"/>
-                <w:color w:val="000000"/>
-                <w:sz w:val="20"/>
-                <w:szCs w:val="20"/>
-              </w:rPr>
-              <w:t xml:space="preserve">Code-level AND hardware-level interlock. Test with unpowered motor first</w:t>
-            </w:r>
-          </w:p>
-        </w:tc>
-      </w:tr>
-      <w:tr>
-        <w:tc>
-          <w:tcPr>
-            <w:tcW w:type="dxa" w:w="400"/>
-            <w:tcBorders>
-              <w:top w:val="single" w:color="CCCCCC" w:sz="1"/>
-              <w:left w:val="single" w:color="CCCCCC" w:sz="1"/>
-              <w:bottom w:val="single" w:color="CCCCCC" w:sz="1"/>
-              <w:right w:val="single" w:color="CCCCCC" w:sz="1"/>
-            </w:tcBorders>
-            <w:shd w:fill="FFFFFF" w:val="clear"/>
-            <w:tcMar>
-              <w:top w:type="dxa" w:w="80"/>
-              <w:left w:type="dxa" w:w="150"/>
-              <w:bottom w:type="dxa" w:w="80"/>
-              <w:right w:type="dxa" w:w="150"/>
-            </w:tcMar>
-            <w:vAlign w:val="center"/>
-          </w:tcPr>
-          <w:p>
-            <w:pPr>
-              <w:jc w:val="center"/>
-            </w:pPr>
-            <w:r>
-              <w:rPr>
-                <w:rFonts w:ascii="Arial" w:cs="Arial" w:eastAsia="Arial" w:hAnsi="Arial"/>
-                <w:b w:val="false"/>
-                <w:bCs w:val="false"/>
-                <w:color w:val="000000"/>
-                <w:sz w:val="20"/>
-                <w:szCs w:val="20"/>
-              </w:rPr>
-              <w:t xml:space="preserve">R6</w:t>
-            </w:r>
-          </w:p>
-        </w:tc>
-        <w:tc>
-          <w:tcPr>
-            <w:tcW w:type="dxa" w:w="2200"/>
-            <w:tcBorders>
-              <w:top w:val="single" w:color="CCCCCC" w:sz="1"/>
-              <w:left w:val="single" w:color="CCCCCC" w:sz="1"/>
-              <w:bottom w:val="single" w:color="CCCCCC" w:sz="1"/>
-              <w:right w:val="single" w:color="CCCCCC" w:sz="1"/>
-            </w:tcBorders>
-            <w:shd w:fill="FFFFFF" w:val="clear"/>
-            <w:tcMar>
-              <w:top w:type="dxa" w:w="80"/>
-              <w:left w:type="dxa" w:w="150"/>
-              <w:bottom w:type="dxa" w:w="80"/>
-              <w:right w:type="dxa" w:w="150"/>
-            </w:tcMar>
-            <w:vAlign w:val="center"/>
-          </w:tcPr>
-          <w:p>
-            <w:pPr>
-              <w:jc w:val="left"/>
-            </w:pPr>
-            <w:r>
-              <w:rPr>
-                <w:rFonts w:ascii="Arial" w:cs="Arial" w:eastAsia="Arial" w:hAnsi="Arial"/>
-                <w:b w:val="false"/>
-                <w:bCs w:val="false"/>
-                <w:color w:val="000000"/>
-                <w:sz w:val="20"/>
-                <w:szCs w:val="20"/>
-              </w:rPr>
-              <w:t xml:space="preserve">Meta Access Token expires</w:t>
-            </w:r>
-          </w:p>
-        </w:tc>
-        <w:tc>
-          <w:tcPr>
-            <w:tcW w:type="dxa" w:w="1000"/>
-            <w:tcBorders>
-              <w:top w:val="single" w:color="CCCCCC" w:sz="1"/>
-              <w:left w:val="single" w:color="CCCCCC" w:sz="1"/>
-              <w:bottom w:val="single" w:color="CCCCCC" w:sz="1"/>
-              <w:right w:val="single" w:color="CCCCCC" w:sz="1"/>
-            </w:tcBorders>
-            <w:shd w:fill="FFE0E0" w:val="clear"/>
-            <w:tcMar>
-              <w:top w:type="dxa" w:w="80"/>
-              <w:left w:type="dxa" w:w="150"/>
-              <w:bottom w:type="dxa" w:w="80"/>
-              <w:right w:type="dxa" w:w="150"/>
-            </w:tcMar>
-            <w:vAlign w:val="center"/>
-          </w:tcPr>
-          <w:p>
-            <w:pPr>
-              <w:jc w:val="left"/>
-            </w:pPr>
-            <w:r>
-              <w:rPr>
-                <w:rFonts w:ascii="Arial" w:cs="Arial" w:eastAsia="Arial" w:hAnsi="Arial"/>
-                <w:b/>
-                <w:bCs/>
-                <w:color w:val="C00000"/>
-                <w:sz w:val="20"/>
-                <w:szCs w:val="20"/>
-              </w:rPr>
-              <w:t xml:space="preserve">HIGH</w:t>
-            </w:r>
-          </w:p>
-        </w:tc>
-        <w:tc>
-          <w:tcPr>
-            <w:tcW w:type="dxa" w:w="2600"/>
-            <w:tcBorders>
-              <w:top w:val="single" w:color="CCCCCC" w:sz="1"/>
-              <w:left w:val="single" w:color="CCCCCC" w:sz="1"/>
-              <w:bottom w:val="single" w:color="CCCCCC" w:sz="1"/>
-              <w:right w:val="single" w:color="CCCCCC" w:sz="1"/>
-            </w:tcBorders>
-            <w:shd w:fill="FFFFFF" w:val="clear"/>
-            <w:tcMar>
-              <w:top w:type="dxa" w:w="80"/>
-              <w:left w:type="dxa" w:w="150"/>
-              <w:bottom w:type="dxa" w:w="80"/>
-              <w:right w:type="dxa" w:w="150"/>
-            </w:tcMar>
-            <w:vAlign w:val="center"/>
-          </w:tcPr>
-          <w:p>
-            <w:pPr>
-              <w:jc w:val="left"/>
-            </w:pPr>
-            <w:r>
-              <w:rPr>
-                <w:rFonts w:ascii="Arial" w:cs="Arial" w:eastAsia="Arial" w:hAnsi="Arial"/>
-                <w:b w:val="false"/>
-                <w:bCs w:val="false"/>
-                <w:color w:val="000000"/>
-                <w:sz w:val="20"/>
-                <w:szCs w:val="20"/>
-              </w:rPr>
-              <w:t xml:space="preserve">WhatsApp replies stop silently</w:t>
-            </w:r>
-          </w:p>
-        </w:tc>
-        <w:tc>
-          <w:tcPr>
-            <w:tcW w:type="dxa" w:w="3772"/>
-            <w:tcBorders>
-              <w:top w:val="single" w:color="CCCCCC" w:sz="1"/>
-              <w:left w:val="single" w:color="CCCCCC" w:sz="1"/>
-              <w:bottom w:val="single" w:color="CCCCCC" w:sz="1"/>
-              <w:right w:val="single" w:color="CCCCCC" w:sz="1"/>
-            </w:tcBorders>
-            <w:shd w:fill="FFFFFF" w:val="clear"/>
-            <w:tcMar>
-              <w:top w:type="dxa" w:w="80"/>
-              <w:left w:type="dxa" w:w="150"/>
-              <w:bottom w:type="dxa" w:w="80"/>
-              <w:right w:type="dxa" w:w="150"/>
-            </w:tcMar>
-            <w:vAlign w:val="center"/>
-          </w:tcPr>
-          <w:p>
-            <w:pPr>
-              <w:jc w:val="left"/>
-            </w:pPr>
-            <w:r>
-              <w:rPr>
-                <w:rFonts w:ascii="Arial" w:cs="Arial" w:eastAsia="Arial" w:hAnsi="Arial"/>
-                <w:b w:val="false"/>
-                <w:bCs w:val="false"/>
-                <w:color w:val="000000"/>
-                <w:sz w:val="20"/>
-                <w:szCs w:val="20"/>
-              </w:rPr>
-              <w:t xml:space="preserve">Use System User Token (never expires). Add 401 error monitoring</w:t>
-            </w:r>
-          </w:p>
-        </w:tc>
-      </w:tr>
-      <w:tr>
-        <w:tc>
-          <w:tcPr>
-            <w:tcW w:type="dxa" w:w="400"/>
-            <w:tcBorders>
-              <w:top w:val="single" w:color="CCCCCC" w:sz="1"/>
-              <w:left w:val="single" w:color="CCCCCC" w:sz="1"/>
-              <w:bottom w:val="single" w:color="CCCCCC" w:sz="1"/>
-              <w:right w:val="single" w:color="CCCCCC" w:sz="1"/>
-            </w:tcBorders>
-            <w:shd w:fill="F5F9FF" w:val="clear"/>
-            <w:tcMar>
-              <w:top w:type="dxa" w:w="80"/>
-              <w:left w:type="dxa" w:w="150"/>
-              <w:bottom w:type="dxa" w:w="80"/>
-              <w:right w:type="dxa" w:w="150"/>
-            </w:tcMar>
-            <w:vAlign w:val="center"/>
-          </w:tcPr>
-          <w:p>
-            <w:pPr>
-              <w:jc w:val="center"/>
-            </w:pPr>
-            <w:r>
-              <w:rPr>
-                <w:rFonts w:ascii="Arial" w:cs="Arial" w:eastAsia="Arial" w:hAnsi="Arial"/>
-                <w:b w:val="false"/>
-                <w:bCs w:val="false"/>
-                <w:color w:val="000000"/>
-                <w:sz w:val="20"/>
-                <w:szCs w:val="20"/>
-              </w:rPr>
-              <w:t xml:space="preserve">R7</w:t>
-            </w:r>
-          </w:p>
-        </w:tc>
-        <w:tc>
-          <w:tcPr>
-            <w:tcW w:type="dxa" w:w="2200"/>
-            <w:tcBorders>
-              <w:top w:val="single" w:color="CCCCCC" w:sz="1"/>
-              <w:left w:val="single" w:color="CCCCCC" w:sz="1"/>
-              <w:bottom w:val="single" w:color="CCCCCC" w:sz="1"/>
-              <w:right w:val="single" w:color="CCCCCC" w:sz="1"/>
-            </w:tcBorders>
-            <w:shd w:fill="F5F9FF" w:val="clear"/>
-            <w:tcMar>
-              <w:top w:type="dxa" w:w="80"/>
-              <w:left w:type="dxa" w:w="150"/>
-              <w:bottom w:type="dxa" w:w="80"/>
-              <w:right w:type="dxa" w:w="150"/>
-            </w:tcMar>
-            <w:vAlign w:val="center"/>
-          </w:tcPr>
-          <w:p>
-            <w:pPr>
-              <w:jc w:val="left"/>
-            </w:pPr>
-            <w:r>
-              <w:rPr>
-                <w:rFonts w:ascii="Arial" w:cs="Arial" w:eastAsia="Arial" w:hAnsi="Arial"/>
-                <w:b w:val="false"/>
-                <w:bCs w:val="false"/>
-                <w:color w:val="000000"/>
-                <w:sz w:val="20"/>
-                <w:szCs w:val="20"/>
-              </w:rPr>
-              <w:t xml:space="preserve">IPX800 0-based vs 1-based index confusion</w:t>
-            </w:r>
-          </w:p>
-        </w:tc>
-        <w:tc>
-          <w:tcPr>
-            <w:tcW w:type="dxa" w:w="1000"/>
-            <w:tcBorders>
-              <w:top w:val="single" w:color="CCCCCC" w:sz="1"/>
-              <w:left w:val="single" w:color="CCCCCC" w:sz="1"/>
-              <w:bottom w:val="single" w:color="CCCCCC" w:sz="1"/>
-              <w:right w:val="single" w:color="CCCCCC" w:sz="1"/>
-            </w:tcBorders>
-            <w:shd w:fill="FFE0E0" w:val="clear"/>
-            <w:tcMar>
-              <w:top w:type="dxa" w:w="80"/>
-              <w:left w:type="dxa" w:w="150"/>
-              <w:bottom w:type="dxa" w:w="80"/>
-              <w:right w:type="dxa" w:w="150"/>
-            </w:tcMar>
-            <w:vAlign w:val="center"/>
-          </w:tcPr>
-          <w:p>
-            <w:pPr>
-              <w:jc w:val="left"/>
-            </w:pPr>
-            <w:r>
-              <w:rPr>
-                <w:rFonts w:ascii="Arial" w:cs="Arial" w:eastAsia="Arial" w:hAnsi="Arial"/>
-                <w:b/>
-                <w:bCs/>
-                <w:color w:val="C00000"/>
-                <w:sz w:val="20"/>
-                <w:szCs w:val="20"/>
-              </w:rPr>
-              <w:t xml:space="preserve">HIGH</w:t>
-            </w:r>
-          </w:p>
-        </w:tc>
-        <w:tc>
-          <w:tcPr>
-            <w:tcW w:type="dxa" w:w="2600"/>
-            <w:tcBorders>
-              <w:top w:val="single" w:color="CCCCCC" w:sz="1"/>
-              <w:left w:val="single" w:color="CCCCCC" w:sz="1"/>
-              <w:bottom w:val="single" w:color="CCCCCC" w:sz="1"/>
-              <w:right w:val="single" w:color="CCCCCC" w:sz="1"/>
-            </w:tcBorders>
-            <w:shd w:fill="F5F9FF" w:val="clear"/>
-            <w:tcMar>
-              <w:top w:type="dxa" w:w="80"/>
-              <w:left w:type="dxa" w:w="150"/>
-              <w:bottom w:type="dxa" w:w="80"/>
-              <w:right w:type="dxa" w:w="150"/>
-            </w:tcMar>
-            <w:vAlign w:val="center"/>
-          </w:tcPr>
-          <w:p>
-            <w:pPr>
-              <w:jc w:val="left"/>
-            </w:pPr>
-            <w:r>
-              <w:rPr>
-                <w:rFonts w:ascii="Arial" w:cs="Arial" w:eastAsia="Arial" w:hAnsi="Arial"/>
-                <w:b w:val="false"/>
-                <w:bCs w:val="false"/>
-                <w:color w:val="000000"/>
-                <w:sz w:val="20"/>
-                <w:szCs w:val="20"/>
-              </w:rPr>
-              <w:t xml:space="preserve">Wrong relay activated — dangerous if curtain relays swapped</w:t>
-            </w:r>
-          </w:p>
-        </w:tc>
-        <w:tc>
-          <w:tcPr>
-            <w:tcW w:type="dxa" w:w="3772"/>
-            <w:tcBorders>
-              <w:top w:val="single" w:color="CCCCCC" w:sz="1"/>
-              <w:left w:val="single" w:color="CCCCCC" w:sz="1"/>
-              <w:bottom w:val="single" w:color="CCCCCC" w:sz="1"/>
-              <w:right w:val="single" w:color="CCCCCC" w:sz="1"/>
-            </w:tcBorders>
-            <w:shd w:fill="F5F9FF" w:val="clear"/>
-            <w:tcMar>
-              <w:top w:type="dxa" w:w="80"/>
-              <w:left w:type="dxa" w:w="150"/>
-              <w:bottom w:type="dxa" w:w="80"/>
-              <w:right w:type="dxa" w:w="150"/>
-            </w:tcMar>
-            <w:vAlign w:val="center"/>
-          </w:tcPr>
-          <w:p>
-            <w:pPr>
-              <w:jc w:val="left"/>
-            </w:pPr>
-            <w:r>
-              <w:rPr>
-                <w:rFonts w:ascii="Arial" w:cs="Arial" w:eastAsia="Arial" w:hAnsi="Arial"/>
-                <w:b w:val="false"/>
-                <w:bCs w:val="false"/>
-                <w:color w:val="000000"/>
-                <w:sz w:val="20"/>
-                <w:szCs w:val="20"/>
-              </w:rPr>
-              <w:t xml:space="preserve">Unit test relay mapping with physical verification before any live testing</w:t>
-            </w:r>
-          </w:p>
-        </w:tc>
-      </w:tr>
-      <w:tr>
-        <w:tc>
-          <w:tcPr>
-            <w:tcW w:type="dxa" w:w="400"/>
-            <w:tcBorders>
-              <w:top w:val="single" w:color="CCCCCC" w:sz="1"/>
-              <w:left w:val="single" w:color="CCCCCC" w:sz="1"/>
-              <w:bottom w:val="single" w:color="CCCCCC" w:sz="1"/>
-              <w:right w:val="single" w:color="CCCCCC" w:sz="1"/>
-            </w:tcBorders>
-            <w:shd w:fill="FFFFFF" w:val="clear"/>
-            <w:tcMar>
-              <w:top w:type="dxa" w:w="80"/>
-              <w:left w:type="dxa" w:w="150"/>
-              <w:bottom w:type="dxa" w:w="80"/>
-              <w:right w:type="dxa" w:w="150"/>
-            </w:tcMar>
-            <w:vAlign w:val="center"/>
-          </w:tcPr>
-          <w:p>
-            <w:pPr>
-              <w:jc w:val="center"/>
-            </w:pPr>
-            <w:r>
-              <w:rPr>
-                <w:rFonts w:ascii="Arial" w:cs="Arial" w:eastAsia="Arial" w:hAnsi="Arial"/>
-                <w:b w:val="false"/>
-                <w:bCs w:val="false"/>
-                <w:color w:val="000000"/>
-                <w:sz w:val="20"/>
-                <w:szCs w:val="20"/>
-              </w:rPr>
-              <w:t xml:space="preserve">R8</w:t>
+              <w:t>R5</w:t>
             </w:r>
           </w:p>
         </w:tc>
@@ -23599,15 +22119,7 @@
               <w:jc w:val="center"/>
             </w:pPr>
             <w:r>
-              <w:rPr>
-                <w:rFonts w:ascii="Arial" w:cs="Arial" w:eastAsia="Arial" w:hAnsi="Arial"/>
-                <w:b w:val="false"/>
-                <w:bCs w:val="false"/>
-                <w:color w:val="000000"/>
-                <w:sz w:val="20"/>
-                <w:szCs w:val="20"/>
-              </w:rPr>
-              <w:t xml:space="preserve">R9</w:t>
+              <w:t>R6</w:t>
             </w:r>
           </w:p>
         </w:tc>
@@ -23776,15 +22288,7 @@
               <w:jc w:val="center"/>
             </w:pPr>
             <w:r>
-              <w:rPr>
-                <w:rFonts w:ascii="Arial" w:cs="Arial" w:eastAsia="Arial" w:hAnsi="Arial"/>
-                <w:b w:val="false"/>
-                <w:bCs w:val="false"/>
-                <w:color w:val="000000"/>
-                <w:sz w:val="20"/>
-                <w:szCs w:val="20"/>
-              </w:rPr>
-              <w:t xml:space="preserve">R10</w:t>
+              <w:t>R7</w:t>
             </w:r>
           </w:p>
         </w:tc>
@@ -23953,15 +22457,7 @@
               <w:jc w:val="center"/>
             </w:pPr>
             <w:r>
-              <w:rPr>
-                <w:rFonts w:ascii="Arial" w:cs="Arial" w:eastAsia="Arial" w:hAnsi="Arial"/>
-                <w:b w:val="false"/>
-                <w:bCs w:val="false"/>
-                <w:color w:val="000000"/>
-                <w:sz w:val="20"/>
-                <w:szCs w:val="20"/>
-              </w:rPr>
-              <w:t xml:space="preserve">R11</w:t>
+              <w:t>R8</w:t>
             </w:r>
           </w:p>
         </w:tc>
@@ -24130,15 +22626,7 @@
               <w:jc w:val="center"/>
             </w:pPr>
             <w:r>
-              <w:rPr>
-                <w:rFonts w:ascii="Arial" w:cs="Arial" w:eastAsia="Arial" w:hAnsi="Arial"/>
-                <w:b w:val="false"/>
-                <w:bCs w:val="false"/>
-                <w:color w:val="000000"/>
-                <w:sz w:val="20"/>
-                <w:szCs w:val="20"/>
-              </w:rPr>
-              <w:t xml:space="preserve">R12</w:t>
+              <w:t>R9</w:t>
             </w:r>
           </w:p>
         </w:tc>
@@ -26193,15 +24681,7 @@
               <w:jc w:val="left"/>
             </w:pPr>
             <w:r>
-              <w:rPr>
-                <w:rFonts w:ascii="Arial" w:cs="Arial" w:eastAsia="Arial" w:hAnsi="Arial"/>
-                <w:b/>
-                <w:bCs/>
-                <w:color w:val="1F4E79"/>
-                <w:sz w:val="20"/>
-                <w:szCs w:val="20"/>
-              </w:rPr>
-              <w:t xml:space="preserve">Verify real public IP (NOT CG-NAT)</w:t>
+              <w:t>Verify VPS and IPX800 on the same LAN</w:t>
             </w:r>
           </w:p>
         </w:tc>
@@ -26228,15 +24708,7 @@
               <w:jc w:val="left"/>
             </w:pPr>
             <w:r>
-              <w:rPr>
-                <w:rFonts w:ascii="Arial" w:cs="Arial" w:eastAsia="Arial" w:hAnsi="Arial"/>
-                <w:b w:val="false"/>
-                <w:bCs w:val="false"/>
-                <w:color w:val="000000"/>
-                <w:sz w:val="20"/>
-                <w:szCs w:val="20"/>
-              </w:rPr>
-              <w:t xml:space="preserve">On a home device: curl ifconfig.me. Compare with router admin WAN IP. Must match. If not, Option A fails — use frp instead.</w:t>
+              <w:t>Confirm both are on the same network. Ping IPX800 LAN IP from VPS. Find IPX800 LAN IP in its Web UI (Network &gt; Parameters) or router DHCP table.</w:t>
             </w:r>
           </w:p>
         </w:tc>
@@ -26300,15 +24772,7 @@
               <w:jc w:val="left"/>
             </w:pPr>
             <w:r>
-              <w:rPr>
-                <w:rFonts w:ascii="Arial" w:cs="Arial" w:eastAsia="Arial" w:hAnsi="Arial"/>
-                <w:b/>
-                <w:bCs/>
-                <w:color w:val="1F4E79"/>
-                <w:sz w:val="20"/>
-                <w:szCs w:val="20"/>
-              </w:rPr>
-              <w:t xml:space="preserve">Register DuckDNS subdomain</w:t>
+              <w:t>Assign IPX800 a static LAN IP</w:t>
             </w:r>
           </w:p>
         </w:tc>
@@ -26335,15 +24799,7 @@
               <w:jc w:val="left"/>
             </w:pPr>
             <w:r>
-              <w:rPr>
-                <w:rFonts w:ascii="Arial" w:cs="Arial" w:eastAsia="Arial" w:hAnsi="Arial"/>
-                <w:b w:val="false"/>
-                <w:bCs w:val="false"/>
-                <w:color w:val="000000"/>
-                <w:sz w:val="20"/>
-                <w:szCs w:val="20"/>
-              </w:rPr>
-              <w:t xml:space="preserve">Go to duckdns.org, create free account, create subdomain (e.g. myhome.duckdns.org). Save the token.</w:t>
+              <w:t>IPX800 Web UI: Network &gt; Parameters &gt; disable DHCP &gt; set fixed IP (e.g. 192.168.1.100). Prevents IP change on DHCP renewal.</w:t>
             </w:r>
           </w:p>
         </w:tc>
@@ -26407,15 +24863,7 @@
               <w:jc w:val="left"/>
             </w:pPr>
             <w:r>
-              <w:rPr>
-                <w:rFonts w:ascii="Arial" w:cs="Arial" w:eastAsia="Arial" w:hAnsi="Arial"/>
-                <w:b/>
-                <w:bCs/>
-                <w:color w:val="1F4E79"/>
-                <w:sz w:val="20"/>
-                <w:szCs w:val="20"/>
-              </w:rPr>
-              <w:t xml:space="preserve">Configure DDNS client on router</w:t>
+              <w:t>Set IPX800_HOST and IPX800_APIKEY in fastapi/.env</w:t>
             </w:r>
           </w:p>
         </w:tc>
@@ -26442,15 +24890,7 @@
               <w:jc w:val="left"/>
             </w:pPr>
             <w:r>
-              <w:rPr>
-                <w:rFonts w:ascii="Arial" w:cs="Arial" w:eastAsia="Arial" w:hAnsi="Arial"/>
-                <w:b w:val="false"/>
-                <w:bCs w:val="false"/>
-                <w:color w:val="000000"/>
-                <w:sz w:val="20"/>
-                <w:szCs w:val="20"/>
-              </w:rPr>
-              <w:t xml:space="preserve">In router admin: find DDNS settings, select DuckDNS, enter subdomain and token. Or deploy cron on any home device: */5 * * * * curl -s https://www.duckdns.org/update?domains=myhome&amp;token=TOKEN&amp;ip=</w:t>
+              <w:t>Edit fastapi/.env: set IPX800_HOST=&lt;IPX800-LAN-IP&gt; (e.g. 192.168.1.100), IPX800_PORT=80, and IPX800_APIKEY=&lt;your-key&gt;.</w:t>
             </w:r>
           </w:p>
         </w:tc>
@@ -26514,15 +24954,7 @@
               <w:jc w:val="left"/>
             </w:pPr>
             <w:r>
-              <w:rPr>
-                <w:rFonts w:ascii="Arial" w:cs="Arial" w:eastAsia="Arial" w:hAnsi="Arial"/>
-                <w:b/>
-                <w:bCs/>
-                <w:color w:val="1F4E79"/>
-                <w:sz w:val="20"/>
-                <w:szCs w:val="20"/>
-              </w:rPr>
-              <w:t xml:space="preserve">Set IPX800 to static LAN IP</w:t>
+              <w:t>Set IPX800 to static LAN IP (confirm in Web UI)</w:t>
             </w:r>
           </w:p>
         </w:tc>
@@ -26621,15 +25053,7 @@
               <w:jc w:val="left"/>
             </w:pPr>
             <w:r>
-              <w:rPr>
-                <w:rFonts w:ascii="Arial" w:cs="Arial" w:eastAsia="Arial" w:hAnsi="Arial"/>
-                <w:b/>
-                <w:bCs/>
-                <w:color w:val="1F4E79"/>
-                <w:sz w:val="20"/>
-                <w:szCs w:val="20"/>
-              </w:rPr>
-              <w:t xml:space="preserve">Configure APIKEY on IPX800</w:t>
+              <w:t>Configure APIKEY on IPX800</w:t>
             </w:r>
           </w:p>
         </w:tc>
@@ -26656,15 +25080,7 @@
               <w:jc w:val="left"/>
             </w:pPr>
             <w:r>
-              <w:rPr>
-                <w:rFonts w:ascii="Arial" w:cs="Arial" w:eastAsia="Arial" w:hAnsi="Arial"/>
-                <w:b w:val="false"/>
-                <w:bCs w:val="false"/>
-                <w:color w:val="000000"/>
-                <w:sz w:val="20"/>
-                <w:szCs w:val="20"/>
-              </w:rPr>
-              <w:t xml:space="preserve">Web UI: Network &gt; API &gt; enable API key protection &gt; set key value &gt; save. Copy value to .env as IPX800_APIKEY.</w:t>
+              <w:t>Web UI: Network &gt; API &gt; enable API key protection &gt; set key value &gt; save. Use same key as IPX800_APIKEY in fastapi/.env.</w:t>
             </w:r>
           </w:p>
         </w:tc>
@@ -26728,15 +25144,7 @@
               <w:jc w:val="left"/>
             </w:pPr>
             <w:r>
-              <w:rPr>
-                <w:rFonts w:ascii="Arial" w:cs="Arial" w:eastAsia="Arial" w:hAnsi="Arial"/>
-                <w:b/>
-                <w:bCs/>
-                <w:color w:val="1F4E79"/>
-                <w:sz w:val="20"/>
-                <w:szCs w:val="20"/>
-              </w:rPr>
-              <w:t xml:space="preserve">Configure router port forwarding</w:t>
+              <w:t>Test relay control from VPS via direct LAN</w:t>
             </w:r>
           </w:p>
         </w:tc>
@@ -26763,15 +25171,7 @@
               <w:jc w:val="left"/>
             </w:pPr>
             <w:r>
-              <w:rPr>
-                <w:rFonts w:ascii="Arial" w:cs="Arial" w:eastAsia="Arial" w:hAnsi="Arial"/>
-                <w:b w:val="false"/>
-                <w:bCs w:val="false"/>
-                <w:color w:val="000000"/>
-                <w:sz w:val="20"/>
-                <w:szCs w:val="20"/>
-              </w:rPr>
-              <w:t xml:space="preserve">Router admin: add rule — Protocol: TCP, External port: 8080, Internal IP: 192.168.1.100, Internal port: 80. Add source IP restriction to VPS public IP if router supports it.</w:t>
+              <w:t>From VPS: curl "http://&lt;IPX800-LAN-IP&gt;:80/preset.htm?led1=1&amp;apikey=XXX". Relay 1 (light) should activate. Verify in IPX800 web UI.</w:t>
             </w:r>
           </w:p>
         </w:tc>
@@ -26835,15 +25235,7 @@
               <w:jc w:val="left"/>
             </w:pPr>
             <w:r>
-              <w:rPr>
-                <w:rFonts w:ascii="Arial" w:cs="Arial" w:eastAsia="Arial" w:hAnsi="Arial"/>
-                <w:b/>
-                <w:bCs/>
-                <w:color w:val="1F4E79"/>
-                <w:sz w:val="20"/>
-                <w:szCs w:val="20"/>
-              </w:rPr>
-              <w:t xml:space="preserve">Test relay control from VPS via DDNS</w:t>
+              <w:t>Test status.xml read from VPS</w:t>
             </w:r>
           </w:p>
         </w:tc>
@@ -26870,15 +25262,7 @@
               <w:jc w:val="left"/>
             </w:pPr>
             <w:r>
-              <w:rPr>
-                <w:rFonts w:ascii="Arial" w:cs="Arial" w:eastAsia="Arial" w:hAnsi="Arial"/>
-                <w:b w:val="false"/>
-                <w:bCs w:val="false"/>
-                <w:color w:val="000000"/>
-                <w:sz w:val="20"/>
-                <w:szCs w:val="20"/>
-              </w:rPr>
-              <w:t xml:space="preserve">From VPS: curl http://myhome.duckdns.org:8080/preset.htm?led1=1&amp;apikey=XXX. Light should turn on. Then curl status.xml to confirm.</w:t>
+              <w:t>From VPS: curl "http://&lt;IPX800-LAN-IP&gt;:80/status.xml?apikey=XXX". Should return XML with &lt;led0&gt;, &lt;led1&gt;, &lt;led2&gt; values.</w:t>
             </w:r>
           </w:p>
         </w:tc>
@@ -28072,13 +26456,7 @@
         <w:ind w:left="360"/>
       </w:pPr>
       <w:r>
-        <w:rPr>
-          <w:rFonts w:ascii="Courier New" w:cs="Courier New" w:eastAsia="Courier New" w:hAnsi="Courier New"/>
-          <w:color w:val="6A9955"/>
-          <w:sz w:val="18"/>
-          <w:szCs w:val="18"/>
-        </w:rPr>
-        <w:t xml:space="preserve"># ── IPX800 V4 (accessed via DDNS + port forwarding) ─────────────</w:t>
+        <w:t># -- IPX800 V4 (accessed via local LAN IP) ---------------------</w:t>
       </w:r>
     </w:p>
     <w:p>
@@ -28088,13 +26466,7 @@
         <w:ind w:left="360"/>
       </w:pPr>
       <w:r>
-        <w:rPr>
-          <w:rFonts w:ascii="Courier New" w:cs="Courier New" w:eastAsia="Courier New" w:hAnsi="Courier New"/>
-          <w:color w:val="1A1A1A"/>
-          <w:sz w:val="18"/>
-          <w:szCs w:val="18"/>
-        </w:rPr>
-        <w:t xml:space="preserve">IPX800_HOST=myhome.duckdns.org</w:t>
+        <w:t>IPX800_HOST=&lt;IPX800-LAN-IP&gt;     # e.g. 192.168.1.100</w:t>
       </w:r>
     </w:p>
     <w:p>
@@ -28104,13 +26476,7 @@
         <w:ind w:left="360"/>
       </w:pPr>
       <w:r>
-        <w:rPr>
-          <w:rFonts w:ascii="Courier New" w:cs="Courier New" w:eastAsia="Courier New" w:hAnsi="Courier New"/>
-          <w:color w:val="1A1A1A"/>
-          <w:sz w:val="18"/>
-          <w:szCs w:val="18"/>
-        </w:rPr>
-        <w:t xml:space="preserve">IPX800_PORT=8080</w:t>
+        <w:t>IPX800_PORT=80</w:t>
       </w:r>
     </w:p>
     <w:p>
@@ -28183,15 +26549,6 @@
         <w:spacing w:after="28" w:before="28"/>
         <w:ind w:left="360"/>
       </w:pPr>
-      <w:r>
-        <w:rPr>
-          <w:rFonts w:ascii="Courier New" w:cs="Courier New" w:eastAsia="Courier New" w:hAnsi="Courier New"/>
-          <w:color w:val="6A9955"/>
-          <w:sz w:val="18"/>
-          <w:szCs w:val="18"/>
-        </w:rPr>
-        <w:t xml:space="preserve"># ── DuckDNS ──────────────────────────────────────────────────────</w:t>
-      </w:r>
     </w:p>
     <w:p>
       <w:pPr>
@@ -28199,15 +26556,6 @@
         <w:spacing w:after="28" w:before="28"/>
         <w:ind w:left="360"/>
       </w:pPr>
-      <w:r>
-        <w:rPr>
-          <w:rFonts w:ascii="Courier New" w:cs="Courier New" w:eastAsia="Courier New" w:hAnsi="Courier New"/>
-          <w:color w:val="1A1A1A"/>
-          <w:sz w:val="18"/>
-          <w:szCs w:val="18"/>
-        </w:rPr>
-        <w:t xml:space="preserve">DUCKDNS_DOMAIN=myhome</w:t>
-      </w:r>
     </w:p>
     <w:p>
       <w:pPr>
@@ -28215,15 +26563,6 @@
         <w:spacing w:after="28" w:before="28"/>
         <w:ind w:left="360"/>
       </w:pPr>
-      <w:r>
-        <w:rPr>
-          <w:rFonts w:ascii="Courier New" w:cs="Courier New" w:eastAsia="Courier New" w:hAnsi="Courier New"/>
-          <w:color w:val="1A1A1A"/>
-          <w:sz w:val="18"/>
-          <w:szCs w:val="18"/>
-        </w:rPr>
-        <w:t xml:space="preserve">DUCKDNS_TOKEN=your-duckdns-token</w:t>
-      </w:r>
     </w:p>
     <w:p>
       <w:pPr>

</xml_diff>